<commit_message>
docs: refresh unified guide for current platform and measured V4 results
</commit_message>
<xml_diff>
--- a/docs/delivery/FSP_MVP.docx
+++ b/docs/delivery/FSP_MVP.docx
@@ -19,14 +19,14 @@
       <w:r>
         <w:t>Обратный найм по подтверждённым навыкам</w:t>
         <w:br/>
-        <w:t>7 октября 2026 · UTC</w:t>
+        <w:t>Редакция 11 октября 2026 · приложение 785d362</w:t>
       </w:r>
     </w:p>
     <w:p>
       <w:r>
         <w:t>Код: github.com/ImmortalDR/CV_hakaton</w:t>
         <w:br/>
-        <w:t>Рабочая ветка: codex/fsp-mvp</w:t>
+        <w:t>Рабочая ветка: codex/platform-fixes-20261011</w:t>
       </w:r>
     </w:p>
     <w:p>
@@ -44,7 +44,412 @@
         <w:pStyle w:val="Heading1"/>
       </w:pPr>
       <w:r>
-        <w:t>Архитектура MVP 1.0.0</w:t>
+        <w:t>Содержание</w:t>
+      </w:r>
+    </w:p>
+    <w:p>
+      <w:r>
+        <w:t>1. Руководство кандидата и работодателя</w:t>
+      </w:r>
+    </w:p>
+    <w:p>
+      <w:r>
+        <w:t>2. Архитектура MVP · редакция 11 октября 2026</w:t>
+      </w:r>
+    </w:p>
+    <w:p>
+      <w:r>
+        <w:t>3. Банк и рубрика 2.0.0</w:t>
+      </w:r>
+    </w:p>
+    <w:p>
+      <w:r>
+        <w:t>4. Данные, модели и пределы доказательств</w:t>
+      </w:r>
+    </w:p>
+    <w:p>
+      <w:r>
+        <w:t>5. Фактические результаты проверки · 11 октября 2026</w:t>
+      </w:r>
+    </w:p>
+    <w:p>
+      <w:r>
+        <w:t>6. Итоговая матрица соответствия · 11 октября 2026</w:t>
+      </w:r>
+    </w:p>
+    <w:p>
+      <w:r>
+        <w:t>7. API 1.0.0</w:t>
+      </w:r>
+    </w:p>
+    <w:p>
+      <w:r>
+        <w:t>8. ФСП ID и будущий Keycloak</w:t>
+      </w:r>
+    </w:p>
+    <w:p>
+      <w:r>
+        <w:t>9. Запуск и сопровождение</w:t>
+      </w:r>
+    </w:p>
+    <w:p>
+      <w:r>
+        <w:t>Версии: API 1.0.0 · банк 2.0.0 · подбор matching-1.1.0. Источники разделов и ссылки: docs/delivery/README.md в репозитории.</w:t>
+      </w:r>
+    </w:p>
+    <w:p>
+      <w:r>
+        <w:br w:type="page"/>
+      </w:r>
+    </w:p>
+    <w:p>
+      <w:pPr>
+        <w:pStyle w:val="Heading1"/>
+      </w:pPr>
+      <w:r>
+        <w:t>Руководство кандидата и работодателя</w:t>
+      </w:r>
+    </w:p>
+    <w:p>
+      <w:r>
+        <w:t>Редакция 11 октября 2026. Стенд: https://85-137-26-131.sslip.io/. Работает демонстрационный режим: подтверждение почты имитируется, достижения ФСП выдаёт явно обозначенный демопровайдер. Для независимой проверки сценария создавайте собственные вымышленные аккаунты: у общих демоаккаунтов сохраняются предыдущие попытки и ограничения. Пароли участников команды в руководстве не публикуются.</w:t>
+      </w:r>
+    </w:p>
+    <w:p>
+      <w:pPr>
+        <w:pStyle w:val="Heading2"/>
+      </w:pPr>
+      <w:r>
+        <w:t>Кандидат: от регистрации до предложения</w:t>
+      </w:r>
+    </w:p>
+    <w:p>
+      <w:r>
+        <w:t>1. Зарегистрируйтесь с ролью кандидата и подтвердите почту доступным в демо способом.</w:t>
+      </w:r>
+    </w:p>
+    <w:p>
+      <w:r>
+        <w:t>2. Заполните профиль: имя, контакты, специализацию, навыки, опыт, роли,    софт-скиллы и заявленный уровень. Дайте согласие на обработку данных.    Ручной ввод реализован; загрузки и автоматического разбора резюме нет.</w:t>
+      </w:r>
+    </w:p>
+    <w:p>
+      <w:r>
+        <w:t>3. Откройте тестирование и выберите Junior, Middle или Senior для Python/бэкенда    либо аналитики/SQL. Доступность, причина ограничения и ближайшая дата видны    до начала. Публикация и обработка — разные согласия; для старта требуется    заполненное имя и согласие на обработку.</w:t>
+      </w:r>
+    </w:p>
+    <w:p>
+      <w:r>
+        <w:t>4. Текущий тест содержит 8 заданий на 30 минут. Для подтверждения нужно    минимум 6 верных ответов и минимум 3 из 4 по основному навыку Python/SQL.    Вводите числовой ответ; десятичная запятая допустима. Пустой ответ не засчитывается.</w:t>
+      </w:r>
+    </w:p>
+    <w:p>
+      <w:r>
+        <w:t>5. После отправки просмотрите процент, число верных ответов и объяснения.    История хранит дату, специализацию, уровень, статус, число вопросов и версию    методики. Старые попытки с 4 заданиями остаются четырёхвопросными.</w:t>
+      </w:r>
+    </w:p>
+    <w:p>
+      <w:r>
+        <w:t>6. Разрешите публикацию, чтобы работодатель видел профиль в банке. Собственный    PDF доступен кандидату; работодателю выдаётся версия с учётом его прав.</w:t>
+      </w:r>
+    </w:p>
+    <w:p>
+      <w:r>
+        <w:t>7. В приглашении проверьте компанию, описание задач, зарплатную вилку в рублях    до вычета налогов и способ связи. Можно принять или отклонить предложение.</w:t>
+      </w:r>
+    </w:p>
+    <w:p>
+      <w:r>
+        <w:t>8. После принятия контакты раскрываются только этой компании, становится    доступен внутренний диалог. Отказ другой компании не раскрывает ей контакты.</w:t>
+      </w:r>
+    </w:p>
+    <w:p>
+      <w:r>
+        <w:t>Неудачный тест и истечение времени не понижают ранее подтверждённый грейд. Пересдача той же специализации/уровня — через 24 часа от начала предыдущей попытки. Смена уже подтверждённого уровня — через 90 дней от последнего изменения. Первый неуспешный тест позволяет добровольно выбрать более низкий уровень; автоматического присвоения его нет. В каждый момент допускается одна активная попытка. Истечение 30 минут проверяет сервер; обновление страницы не продлевает срок.</w:t>
+      </w:r>
+    </w:p>
+    <w:p>
+      <w:pPr>
+        <w:pStyle w:val="Heading2"/>
+      </w:pPr>
+      <w:r>
+        <w:t>Приватность и ФСП</w:t>
+      </w:r>
+    </w:p>
+    <w:p>
+      <w:r>
+        <w:t>До принятия работодатель не видит имя, контакты и произвольный текст кандидата, в том числе в PDF. Проверенные навыки и разрешённые поля доступны в обезличенной карточке. Стаж можно скрыть отдельно. Его наличие в анкете означает самодекларацию, а не объективное доказательство требования.</w:t>
+      </w:r>
+    </w:p>
+    <w:p>
+      <w:r>
+        <w:t>Отзыв публикации/обработки закрывает профиль и ранее выданные права, включая контакты в старых приглашениях и доступ к диалогу. Повторная публикация не возвращает прежнее разрешение: требуется новое приглашение и принятие. Уже скачанную стороной копию PDF технически отозвать невозможно.</w:t>
+      </w:r>
+    </w:p>
+    <w:p>
+      <w:r>
+        <w:t>Привязка демонстрационного ФСП необязательна. Она не повышает профессиональный грейд. Без неё доступны тестирование, подбор, приглашения и диалог. Настоящие учётные данные ФСП/Keycloak в демопривязку вводить не нужно.</w:t>
+      </w:r>
+    </w:p>
+    <w:p>
+      <w:pPr>
+        <w:pStyle w:val="Heading2"/>
+      </w:pPr>
+      <w:r>
+        <w:t>Работодатель: от потребности до диалога</w:t>
+      </w:r>
+    </w:p>
+    <w:p>
+      <w:r>
+        <w:t>1. Зарегистрируйтесь как работодатель, подтвердите почту и заполните компанию:    название, описание, деятельность и контакт для кандидатов.</w:t>
+      </w:r>
+    </w:p>
+    <w:p>
+      <w:r>
+        <w:t>2. В банке кандидатов выберите специализацию, грейд и фильтры. Фильтр навыка    требует подтверждённого доказательства; неизвестный навык его не проходит.</w:t>
+      </w:r>
+    </w:p>
+    <w:p>
+      <w:r>
+        <w:t>3. Создайте потребность: описание, специализация, допустимые уровни,    обязательные/желательные навыки, при необходимости стаж и фильтр ФСП.    Подтвердите структурированные поля. Свободный текст сам не разбирается моделью.</w:t>
+      </w:r>
+    </w:p>
+    <w:p>
+      <w:r>
+        <w:t>4. В подборке смотрите источник, дату и версию доказательств. «Подтверждено»    означает положительный результат проверки; «Требование не выполнено» —    отрицательный результат; «Не проверено» — отсутствие подтверждения.    Частичные совпадения не скрываются автоматически. Индекс подбора — не    вероятность найма и не объективная оценка пригодности в процентах.</w:t>
+      </w:r>
+    </w:p>
+    <w:p>
+      <w:r>
+        <w:t>5. Уточнение запроса создаёт новый снимок. Предыдущая подборка сохраняется;    её доказательства исторические, но приватность проверяется на момент чтения.</w:t>
+      </w:r>
+    </w:p>
+    <w:p>
+      <w:r>
+        <w:t>6. Отправьте адресное приглашение: описание и целочисленная зарплатная вилка    от 1 до 10 000 000 ₽, нижняя граница не выше верхней. Опубликованная вакансия    не требуется. Компания и контакт добавляются из её профиля.</w:t>
+      </w:r>
+    </w:p>
+    <w:p>
+      <w:r>
+        <w:t>7. Дождитесь решения. После принятия откройте контакты, актуальный PDF и диалог.    Принятие другой компании не даёт вашей компании права на контакты.</w:t>
+      </w:r>
+    </w:p>
+    <w:p>
+      <w:pPr>
+        <w:pStyle w:val="Heading2"/>
+      </w:pPr>
+      <w:r>
+        <w:t>Типичные ситуации</w:t>
+      </w:r>
+    </w:p>
+    <w:tbl>
+      <w:tblPr>
+        <w:tblStyle w:val="LightShading-Accent1"/>
+        <w:tblW w:type="auto" w:w="0"/>
+        <w:tblLook w:firstColumn="1" w:firstRow="1" w:lastColumn="0" w:lastRow="0" w:noHBand="0" w:noVBand="1" w:val="04A0"/>
+      </w:tblPr>
+      <w:tblGrid>
+        <w:gridCol w:w="5112"/>
+        <w:gridCol w:w="5112"/>
+      </w:tblGrid>
+      <w:tr>
+        <w:trPr>
+          <w:tblHeader/>
+          <w:cantSplit/>
+        </w:trPr>
+        <w:tc>
+          <w:tcPr>
+            <w:tcW w:type="dxa" w:w="5112"/>
+          </w:tcPr>
+          <w:p>
+            <w:r>
+              <w:t>Ситуация</w:t>
+            </w:r>
+          </w:p>
+        </w:tc>
+        <w:tc>
+          <w:tcPr>
+            <w:tcW w:type="dxa" w:w="5112"/>
+          </w:tcPr>
+          <w:p>
+            <w:r>
+              <w:t>Действие / объяснение</w:t>
+            </w:r>
+          </w:p>
+        </w:tc>
+      </w:tr>
+      <w:tr>
+        <w:trPr>
+          <w:cantSplit/>
+        </w:trPr>
+        <w:tc>
+          <w:tcPr>
+            <w:tcW w:type="dxa" w:w="5112"/>
+          </w:tcPr>
+          <w:p>
+            <w:r>
+              <w:t>Кнопка теста недоступна</w:t>
+            </w:r>
+          </w:p>
+        </w:tc>
+        <w:tc>
+          <w:tcPr>
+            <w:tcW w:type="dxa" w:w="5112"/>
+          </w:tcPr>
+          <w:p>
+            <w:r>
+              <w:t>Прочитайте причину и дату; завершите активную попытку либо дождитесь 24 часов / 90 дней. Для незаполненного профиля календарная дата не обещается.</w:t>
+            </w:r>
+          </w:p>
+        </w:tc>
+      </w:tr>
+      <w:tr>
+        <w:trPr>
+          <w:cantSplit/>
+        </w:trPr>
+        <w:tc>
+          <w:tcPr>
+            <w:tcW w:type="dxa" w:w="5112"/>
+          </w:tcPr>
+          <w:p>
+            <w:r>
+              <w:t>История показывает 4 задания</w:t>
+            </w:r>
+          </w:p>
+        </w:tc>
+        <w:tc>
+          <w:tcPr>
+            <w:tcW w:type="dxa" w:w="5112"/>
+          </w:tcPr>
+          <w:p>
+            <w:r>
+              <w:t>Это сохранённая попытка старой методики, а не текущая конфигурация нового теста.</w:t>
+            </w:r>
+          </w:p>
+        </w:tc>
+      </w:tr>
+      <w:tr>
+        <w:trPr>
+          <w:cantSplit/>
+        </w:trPr>
+        <w:tc>
+          <w:tcPr>
+            <w:tcW w:type="dxa" w:w="5112"/>
+          </w:tcPr>
+          <w:p>
+            <w:r>
+              <w:t>Навык указан в анкете, но «Не проверено»</w:t>
+            </w:r>
+          </w:p>
+        </w:tc>
+        <w:tc>
+          <w:tcPr>
+            <w:tcW w:type="dxa" w:w="5112"/>
+          </w:tcPr>
+          <w:p>
+            <w:r>
+              <w:t>Самодекларация не заменяет подтверждение. Docker/React текущим банком не проверяются.</w:t>
+            </w:r>
+          </w:p>
+        </w:tc>
+      </w:tr>
+      <w:tr>
+        <w:trPr>
+          <w:cantSplit/>
+        </w:trPr>
+        <w:tc>
+          <w:tcPr>
+            <w:tcW w:type="dxa" w:w="5112"/>
+          </w:tcPr>
+          <w:p>
+            <w:r>
+              <w:t>Зарплатное предложение не отправляется</w:t>
+            </w:r>
+          </w:p>
+        </w:tc>
+        <w:tc>
+          <w:tcPr>
+            <w:tcW w:type="dxa" w:w="5112"/>
+          </w:tcPr>
+          <w:p>
+            <w:r>
+              <w:t>Проверьте положительные целые значения, верхний предел и порядок границ; ошибка показана рядом с формой.</w:t>
+            </w:r>
+          </w:p>
+        </w:tc>
+      </w:tr>
+      <w:tr>
+        <w:trPr>
+          <w:cantSplit/>
+        </w:trPr>
+        <w:tc>
+          <w:tcPr>
+            <w:tcW w:type="dxa" w:w="5112"/>
+          </w:tcPr>
+          <w:p>
+            <w:r>
+              <w:t>После принятия контактов снова нет</w:t>
+            </w:r>
+          </w:p>
+        </w:tc>
+        <w:tc>
+          <w:tcPr>
+            <w:tcW w:type="dxa" w:w="5112"/>
+          </w:tcPr>
+          <w:p>
+            <w:r>
+              <w:t>Кандидат мог отозвать согласие; старый снимок не обходит текущие права.</w:t>
+            </w:r>
+          </w:p>
+        </w:tc>
+      </w:tr>
+      <w:tr>
+        <w:trPr>
+          <w:cantSplit/>
+        </w:trPr>
+        <w:tc>
+          <w:tcPr>
+            <w:tcW w:type="dxa" w:w="5112"/>
+          </w:tcPr>
+          <w:p>
+            <w:r>
+              <w:t>Сессия истекла</w:t>
+            </w:r>
+          </w:p>
+        </w:tc>
+        <w:tc>
+          <w:tcPr>
+            <w:tcW w:type="dxa" w:w="5112"/>
+          </w:tcPr>
+          <w:p>
+            <w:r>
+              <w:t>Войдите повторно. Восстановление забытого пароля через UI пока не реализовано.</w:t>
+            </w:r>
+          </w:p>
+        </w:tc>
+      </w:tr>
+    </w:tbl>
+    <w:p>
+      <w:r>
+        <w:t>Даты в UI и PDF показаны в МСК (UTC+03:00), даты API — ISO 8601/UTC. Интерфейс проверен в Chromium при ширинах 360, 390 и 768 px; проверка на всех физических устройствах и во всех браузерах не заявляется.</w:t>
+      </w:r>
+    </w:p>
+    <w:p>
+      <w:r>
+        <w:br w:type="page"/>
+      </w:r>
+    </w:p>
+    <w:p>
+      <w:pPr>
+        <w:pStyle w:val="Heading1"/>
+      </w:pPr>
+      <w:r>
+        <w:t>Архитектура MVP · редакция 11 октября 2026</w:t>
+      </w:r>
+    </w:p>
+    <w:p>
+      <w:r>
+        <w:t>Состояние приложения: 785d362, банк 2.0.0, подбор matching-1.1.0.</w:t>
       </w:r>
     </w:p>
     <w:p>
@@ -96,7 +501,7 @@
     </w:p>
     <w:p>
       <w:r>
-        <w:t>Сначала точная специализация и один из выбранных подтверждённых грейдов; неподтверждённый профиль есть только в отдельной группе банка. Затем внутри каждой категории применяется matching-1.0.0:</w:t>
+        <w:t>Сначала точная специализация и один из выбранных подтверждённых грейдов; неподтверждённый профиль есть только в отдельной группе банка. Затем внутри каждой категории применяется matching-1.1.0:</w:t>
       </w:r>
     </w:p>
     <w:p>
@@ -116,7 +521,25 @@
     </w:p>
     <w:p>
       <w:r>
-        <w:t>Описание потребности сохраняется для контекста. Пользователь сам задаёт структуру и подтверждает её; автоматического NLP-разбора нет. Обязательный навык — критерий оценки, а не жёсткое исключение: слабые совпадения остаются видимыми с unknown/unmet. Контрольный запрос React в оценке показывает ограничение этого подхода. В дальнейшем можно добавить явный режим «только все обязательные навыки подтверждены».</w:t>
+        <w:t>Описание потребности сохраняется для контекста. Пользователь сам задаёт структуру и подтверждает её; автоматического NLP-разбора нет. Обязательный навык — критерий оценки, а не жёсткое исключение: слабые совпадения остаются видимыми с unknown/unmet. Контрольный запрос React в оценке показывает ограничение этого подхода. В 1.1.0 выдаются required_skills_met, missing_skills и unmet_skills: UI отдельно объясняет полное и частичное совпадение. Этот признак не меняет числовую формулу; стаж остаётся отдельной самодекларацией.</w:t>
+      </w:r>
+    </w:p>
+    <w:p>
+      <w:r>
+        <w:t>Исследовательские модели V4/V4-CV не вызываются этим маршрутом. Их CLI, данные и метрики находятся в dataset/training/. Сервис не обучается автоматически на загруженных CSV и не присваивает грейд по текстовой близости резюме. См. Данные и модели (DATA_AND_MODELS.md).</w:t>
+      </w:r>
+    </w:p>
+    <w:p>
+      <w:pPr>
+        <w:pStyle w:val="Heading2"/>
+      </w:pPr>
+      <w:r>
+        <w:t>Тестирование и версии</w:t>
+      </w:r>
+    </w:p>
+    <w:p>
+      <w:r>
+        <w:t>assessment.py связывает текущую конфигурацию банка, историческую рубрику попытки и политику доступности. До старта GET assessment-availability возвращает конфигурацию каждого уровня; после старта число вопросов берётся из сохранённого Attempt.questions. Версия попытки определяет пороги оценки. Эти данные используются в заголовке, результате и истории, включая старые попытки. Старт повторяет проверку 24/90 дней под блокировкой Profile: предварительный запрос UI не является разрешением в обход сервера.</w:t>
       </w:r>
     </w:p>
     <w:p>
@@ -162,12 +585,12 @@
         <w:pStyle w:val="Heading1"/>
       </w:pPr>
       <w:r>
-        <w:t>Банк и рубрика</w:t>
+        <w:t>Банк и рубрика 2.0.0</w:t>
       </w:r>
     </w:p>
     <w:p>
       <w:r>
-        <w:t>Версия банка 1.1.0, два направления и три уровня. 12 собственных семейств, в каждой попытке два варианта каждого из двух семейств категории: четыре числовых ответа за 30 минут. Один верный ответ — 25 баллов, подтверждение выбранного грейда — от 75. Навык считается met при не менее 75% ответов своего семейства; при двух вопросах это 2/2. Успешный тест с 3/4 поэтому может оставить один навык unmet. Это видно работодателю отдельно от общего грейда.</w:t>
+        <w:t>Восемь числовых заданий за 30 минут: четыре семейства, два варианта каждого. Четыре вопроса проверяют основной навык Python/SQL, четыре — вспомогательный. Проходной результат: не менее 6/8 и не менее 3/4 по основному навыку. Для любого навыка met означает не менее 75% верных ответов по этому навыку. Баллы не округляются вниз: 7/8 = 87,5%. Неудача сохраняет прежний грейд.</w:t>
       </w:r>
     </w:p>
     <w:tbl>
@@ -182,6 +605,10 @@
         <w:gridCol w:w="3408"/>
       </w:tblGrid>
       <w:tr>
+        <w:trPr>
+          <w:tblHeader/>
+          <w:cantSplit/>
+        </w:trPr>
         <w:tc>
           <w:tcPr>
             <w:tcW w:type="dxa" w:w="3408"/>
@@ -198,7 +625,7 @@
           </w:tcPr>
           <w:p>
             <w:r>
-              <w:t>Семейства</w:t>
+              <w:t>Основные семейства</w:t>
             </w:r>
           </w:p>
         </w:tc>
@@ -208,12 +635,15 @@
           </w:tcPr>
           <w:p>
             <w:r>
-              <w:t>Что проверяется</w:t>
+              <w:t>Вспомогательные семейства</w:t>
             </w:r>
           </w:p>
         </w:tc>
       </w:tr>
       <w:tr>
+        <w:trPr>
+          <w:cantSplit/>
+        </w:trPr>
         <w:tc>
           <w:tcPr>
             <w:tcW w:type="dxa" w:w="3408"/>
@@ -230,7 +660,7 @@
           </w:tcPr>
           <w:p>
             <w:r>
-              <w:t>py_filter, py_boundary</w:t>
+              <w:t>фильтрация и сумма; накопление с индексами</w:t>
             </w:r>
           </w:p>
         </w:tc>
@@ -240,12 +670,15 @@
           </w:tcPr>
           <w:p>
             <w:r>
-              <w:t>фильтрация/сумма; ошибки включения границ</w:t>
+              <w:t>включённые границы; поиск дефекта abs</w:t>
             </w:r>
           </w:p>
         </w:tc>
       </w:tr>
       <w:tr>
+        <w:trPr>
+          <w:cantSplit/>
+        </w:trPr>
         <w:tc>
           <w:tcPr>
             <w:tcW w:type="dxa" w:w="3408"/>
@@ -262,7 +695,7 @@
           </w:tcPr>
           <w:p>
             <w:r>
-              <w:t>py_alias, http_keys</w:t>
+              <w:t>общие ссылки списков; изменяемый аргумент по умолчанию</w:t>
             </w:r>
           </w:p>
         </w:tc>
@@ -272,12 +705,15 @@
           </w:tcPr>
           <w:p>
             <w:r>
-              <w:t>общие ссылки вложенных списков; идемпотентность</w:t>
+              <w:t>идемпотентность; фиксированные окна лимита API</w:t>
             </w:r>
           </w:p>
         </w:tc>
       </w:tr>
       <w:tr>
+        <w:trPr>
+          <w:cantSplit/>
+        </w:trPr>
         <w:tc>
           <w:tcPr>
             <w:tcW w:type="dxa" w:w="3408"/>
@@ -294,7 +730,7 @@
           </w:tcPr>
           <w:p>
             <w:r>
-              <w:t>py_dag, http_backoff</w:t>
+              <w:t>зависимости задач; поведение LRU-кеша</w:t>
             </w:r>
           </w:p>
         </w:tc>
@@ -304,12 +740,15 @@
           </w:tcPr>
           <w:p>
             <w:r>
-              <w:t>зависимости параллельных задач; время повторов API</w:t>
+              <w:t>backoff; ограниченные повторы по кодам ответа</w:t>
             </w:r>
           </w:p>
         </w:tc>
       </w:tr>
       <w:tr>
+        <w:trPr>
+          <w:cantSplit/>
+        </w:trPr>
         <w:tc>
           <w:tcPr>
             <w:tcW w:type="dxa" w:w="3408"/>
@@ -326,7 +765,7 @@
           </w:tcPr>
           <w:p>
             <w:r>
-              <w:t>sql_where, stats_median</w:t>
+              <w:t>WHERE/SUM; NULL/COALESCE</w:t>
             </w:r>
           </w:p>
         </w:tc>
@@ -336,12 +775,15 @@
           </w:tcPr>
           <w:p>
             <w:r>
-              <w:t>фильтр/агрегация; медиана</w:t>
+              <w:t>медиана; среднее после удаления ошибочного замера</w:t>
             </w:r>
           </w:p>
         </w:tc>
       </w:tr>
       <w:tr>
+        <w:trPr>
+          <w:cantSplit/>
+        </w:trPr>
         <w:tc>
           <w:tcPr>
             <w:tcW w:type="dxa" w:w="3408"/>
@@ -358,7 +800,7 @@
           </w:tcPr>
           <w:p>
             <w:r>
-              <w:t>sql_join, stats_weighted</w:t>
+              <w:t>LEFT JOIN; GROUP BY/HAVING</w:t>
             </w:r>
           </w:p>
         </w:tc>
@@ -368,12 +810,15 @@
           </w:tcPr>
           <w:p>
             <w:r>
-              <w:t>отсутствие связей при LEFT JOIN; взвешенная конверсия</w:t>
+              <w:t>взвешенная доля; условная конверсия</w:t>
             </w:r>
           </w:p>
         </w:tc>
       </w:tr>
       <w:tr>
+        <w:trPr>
+          <w:cantSplit/>
+        </w:trPr>
         <w:tc>
           <w:tcPr>
             <w:tcW w:type="dxa" w:w="3408"/>
@@ -390,7 +835,7 @@
           </w:tcPr>
           <w:p>
             <w:r>
-              <w:t>sql_rank, tx_snapshot</w:t>
+              <w:t>DENSE_RANK; оконная сумма по группе</w:t>
             </w:r>
           </w:p>
         </w:tc>
@@ -400,7 +845,7 @@
           </w:tcPr>
           <w:p>
             <w:r>
-              <w:t>плотный ранг; потерянное обновление</w:t>
+              <w:t>потерянное обновление; оптимистическая блокировка</w:t>
             </w:r>
           </w:p>
         </w:tc>
@@ -408,17 +853,12 @@
     </w:tbl>
     <w:p>
       <w:r>
-        <w:t>Параметры: a=2…9, b=2…8; основной список — семь чисел 1…20. Граничные входы выбираются из a−2…a+b+2 с возможными повторами. Для DAG c=2…12; повторы HTTP — 3…5 попыток; восемь идемпотентных запросов из четырёх ключей; шесть заказов с customer_id из 1…4 при пяти клиентах. Точные генераторы, эталонные формулы и объяснения находятся в apps/api/fsp/bank.py.</w:t>
+        <w:t>Итого 24 семейства. Порядок воспроизводимо перемешивается; в семействе меняются числа/входы, сохраняются тип операций и структура. Исходные формулы — bank.py, отдельные решения — evaluation/oracles.py (исполнение SQL в SQLite, реальный functools.lru_cache, семантика Python, альтернативные вычисления).</w:t>
       </w:r>
     </w:p>
     <w:p>
       <w:r>
-        <w:t>Используется отдельный random.Random(seed), версия и полный вариант сохраняются в PostgreSQL. SHA-256 текста набора уникален в БД; генератор пробует до 20 новых seed при совпадении. Клиент не выбирает seed и не присылает оценку. До завершения в API только текст и навык. После завершения доступны правильные ответы и объяснения; повторная сдача сохраняет первый результат.</w:t>
-      </w:r>
-    </w:p>
-    <w:p>
-      <w:r>
-        <w:t>Ответ обрабатывается Decimal; поддерживаются точка/запятая, пробелы вокруг числа. Допуск 0,005 для округления. NaN, Infinity, пустые и нечисловые ответы не засчитываются. Генерация не использует LLM в runtime и не запускает пользовательский код. Набор evaluation/oracles.py отдельно решает задачи: SQL выполняется в памяти, Python-семантика и расписания моделируются пошагово.</w:t>
+        <w:t>Сервер сохраняет seed, версию, весь текст, параметры, эталоны и результат. Клиент получает только текст/навык/id до завершения; балл и ключи задаёт сервер. Перед ответом проверяется, что номер вопроса входит в сохранённую попытку. Одинаковая завершённая попытка повторно не оценивается. SHA-256 набора уникален в БД; генератор пробует до 20 новых seed. Ответы проверяются через Decimal, запятая допускается, NaN/Infinity/пустые ответы не засчитываются, допуск 0,005.</w:t>
       </w:r>
     </w:p>
     <w:p>
@@ -426,17 +866,32 @@
         <w:pStyle w:val="Heading2"/>
       </w:pPr>
       <w:r>
-        <w:t>История и изменения уровня</w:t>
+        <w:t>Совместимость</w:t>
       </w:r>
     </w:p>
     <w:p>
       <w:r>
-        <w:t>Первый неуспешный тест не присваивает грейд. Можно сразу самостоятельно выбрать другой, в том числе более низкий уровень. Пересдача той же пары специализация/уровень — через 24 часа от старта последней попытки. После подтверждения смена грейда, включая добровольное понижение, возможна через 90 дней от последней успешной смены. Тест того же уровня разрешён с отдельным интервалом 24 часа. Границы включённые: ровно 24 часа или 90 дней — разрешено. Повторное успешное подтверждение того же грейда не сдвигает дату смены. Провал и истечение времени сохраняют прежний грейд.</w:t>
+        <w:t>- 1.0.0/1.1.0: четыре вопроса, общий порог 75%.</w:t>
       </w:r>
     </w:p>
     <w:p>
       <w:r>
-        <w:t>В один момент у пользователя одна активная попытка. При смене вкладки она восстанавливается. До завершения попытки специализацию менять нельзя; после первого подтверждения специализация в MVP закреплена. Переход на другую специализацию после подтверждения пока не поддерживается.</w:t>
+        <w:t>- 1.2.0: четыре вопроса, 75% и 2/2 по основному навыку.</w:t>
+      </w:r>
+    </w:p>
+    <w:p>
+      <w:r>
+        <w:t>- 2.0.0: восемь вопросов, 75% и 3/4 по основному навыку.</w:t>
+      </w:r>
+    </w:p>
+    <w:p>
+      <w:r>
+        <w:t>Старые активные попытки оцениваются по собственной версии; их вопросы не генерируются заново. Генератор воспроизводит 1.1.0 и 1.2.0, это проверено замороженными fingerprint исходных релизов. Для 1.0.0 используется сохранённый набор; заново генерировать его этот код не обещает. Интерфейс получает рубрику каждой попытки от сервера, включая исторические.</w:t>
+      </w:r>
+    </w:p>
+    <w:p>
+      <w:r>
+        <w:t>Первый провал не присваивает низкий грейд. Тест ниже можно выбрать добровольно. Пересдача той же пары категория/грейд — через 24 часа от старта; смена уже подтверждённого грейда — через 90 дней после успешной смены. Повторное подтверждение того же грейда не сдвигает дату. В один момент одна активная попытка. Истечение срока не меняет грейд. Переход специализации после первого подтверждения в MVP не поддерживается.</w:t>
       </w:r>
     </w:p>
     <w:p>
@@ -444,22 +899,22 @@
         <w:pStyle w:val="Heading2"/>
       </w:pPr>
       <w:r>
-        <w:t>Границы выводов</w:t>
+        <w:t>Измерения и границы</w:t>
       </w:r>
     </w:p>
     <w:p>
       <w:r>
-        <w:t>Числовая параметризация затрудняет распространение конкретных ответов, но решение семейства остаётся узнаваемым. Нет прокторинга и защиты от LLM, подсказок другого человека или выученного алгоритма. Четыре задания не покрывают все обязанности Junior/Middle/Senior. Названия уровней — рубрика демонстрации, а не подтверждённый профессиональным сообществом стандарт.</w:t>
+        <w:t>Сравнение версий (../../evaluation/bank_v2_results.json): 42000 симулированных попыток, 36000 независимых сверок ответов, расхождений 0. Частые ответы семейства выбирались только на 200 dev-вариантах; проверялись на других 500 вариантах каждой категории. В 2.0.0 успехов угадывания 0/3000, в 1.2.0 — 75/3000. Ноль не означает невозможность угадывания: 95% верхняя граница Wilson при 0/500 — около 0,76% для одной категории в данной синтетической модели.</w:t>
       </w:r>
     </w:p>
     <w:p>
       <w:r>
-        <w:t>Версия 1.1.0 исправляет постоянный ответ граничного семейства из черновой 1.0.0. Сохранённые ранние демопопытки остаются со своей версией и своим эталоном. Они не перезаписываются при обновлении банка.</w:t>
+        <w:t>При независимой вероятности ошибки 20% на вопрос средняя доля успеха выросла с 59,33% до 71,4%, попарное совпадение исходов — с 51,67% до 59,14%. Это поведение модели, а не наблюдения людей. Все семьи узнаваемы: заучивание метода решения, внешняя помощь и LLM остаются возможными. Docker/React не проверяются этим банком. Восемь числовых заданий не доказывают профессиональный грейд и не охватывают всю работу Senior.</w:t>
       </w:r>
     </w:p>
     <w:p>
       <w:r>
-        <w:t>Фактические числа, матрица ошибок и ограничения оценки приведены в VALIDATION.md и evaluation/results.json. Следующий необходимый шаг — слепая оценка заданий профильными экспертами и пилот на людях с несколькими вариантами, независимыми метками, анализом сложности и пограничных результатов.</w:t>
+        <w:t>Порог и длительность — решения команды до измерения, а не эмпирическая калибровка. Следующий этап — содержательное экспертное ревью и реальный пилот: инструкция и инструменты (HUMAN_PILOT.md). Участников и независимых человеческих меток пока 0, такие результаты помечены not_run.</w:t>
       </w:r>
     </w:p>
     <w:p>
@@ -472,12 +927,12 @@
         <w:pStyle w:val="Heading1"/>
       </w:pPr>
       <w:r>
-        <w:t>Фактические результаты проверки</w:t>
+        <w:t>Данные, модели и пределы доказательств</w:t>
       </w:r>
     </w:p>
     <w:p>
       <w:r>
-        <w:t>Проверка проведена 7 октября 2026, UTC, на Linux x86_64, 2 логических CPU, около 3,82 GiB RAM. Исходные логи локально в audit/current/; публикуемые машиночитаемые результаты — рядом с этим документом и в evaluation/. Ниже разделены исполненные проверки и невыполненная внешняя валидация.</w:t>
+        <w:t>В продукте различаются три механизма: серверный тест навыков, объяснимый подбор по доказательствам и исследовательское текстовое ранжирование V4. Их результаты и метрики нельзя подменять друг другом.</w:t>
       </w:r>
     </w:p>
     <w:p>
@@ -485,7 +940,229 @@
         <w:pStyle w:val="Heading2"/>
       </w:pPr>
       <w:r>
-        <w:t>Исполненные проверки</w:t>
+        <w:t>Что работает в приложении</w:t>
+      </w:r>
+    </w:p>
+    <w:p>
+      <w:r>
+        <w:t>Банк 2.0.0 генерирует параметрические задания, проверяет числовые ответы и выдаёт доказательства навыков по зафиксированной рубрике. Это собственный алгоритм, а не нейросеть, обученная на резюме. Устойчивость проверена симуляцией; пилота с людьми и внешней сертификации профессиональных грейдов пока нет.</w:t>
+      </w:r>
+    </w:p>
+    <w:p>
+      <w:r>
+        <w:t>Подбор matching-1.1.0 использует специализацию, подтверждённый грейд, доказательства обязательных/желательных навыков, результат теста и ограниченный бонус ФСП. Формула описана в ARCHITECTURE.md. Нейросетевые модели из исследовательского каталога в действующем API не подключены. Сама загрузка CSV на сервер не обучает приложение и не добавляет реальные резюме в его публичную БД.</w:t>
+      </w:r>
+    </w:p>
+    <w:p>
+      <w:pPr>
+        <w:pStyle w:val="Heading2"/>
+      </w:pPr>
+      <w:r>
+        <w:t>Реальные данные V4</w:t>
+      </w:r>
+    </w:p>
+    <w:p>
+      <w:r>
+        <w:t>Источник — Trudvsem / RCSI: https://data.rcsi.science/data-catalog/datasets/186/. Карточка происхождения и подготовки: dataset/training/DATA_CARD_V4.md. Проверены хеши шести исходных таблиц; отобраны 2 306 IT-вакансий.</w:t>
+      </w:r>
+    </w:p>
+    <w:tbl>
+      <w:tblPr>
+        <w:tblStyle w:val="LightShading-Accent1"/>
+        <w:tblW w:type="auto" w:w="0"/>
+        <w:tblLook w:firstColumn="1" w:firstRow="1" w:lastColumn="0" w:lastRow="0" w:noHBand="0" w:noVBand="1" w:val="04A0"/>
+      </w:tblPr>
+      <w:tblGrid>
+        <w:gridCol w:w="5112"/>
+        <w:gridCol w:w="5112"/>
+      </w:tblGrid>
+      <w:tr>
+        <w:trPr>
+          <w:tblHeader/>
+          <w:cantSplit/>
+        </w:trPr>
+        <w:tc>
+          <w:tcPr>
+            <w:tcW w:type="dxa" w:w="5112"/>
+          </w:tcPr>
+          <w:p>
+            <w:r>
+              <w:t>Набор</w:t>
+            </w:r>
+          </w:p>
+        </w:tc>
+        <w:tc>
+          <w:tcPr>
+            <w:tcW w:type="dxa" w:w="5112"/>
+          </w:tcPr>
+          <w:p>
+            <w:r>
+              <w:t>Объём и роль</w:t>
+            </w:r>
+          </w:p>
+        </w:tc>
+      </w:tr>
+      <w:tr>
+        <w:trPr>
+          <w:cantSplit/>
+        </w:trPr>
+        <w:tc>
+          <w:tcPr>
+            <w:tcW w:type="dxa" w:w="5112"/>
+          </w:tcPr>
+          <w:p>
+            <w:r>
+              <w:t>Исторические пары с явным исходом</w:t>
+            </w:r>
+          </w:p>
+        </w:tc>
+        <w:tc>
+          <w:tcPr>
+            <w:tcW w:type="dxa" w:w="5112"/>
+          </w:tcPr>
+          <w:p>
+            <w:r>
+              <w:t>1 691: train 1 551 / validation 63 / test 77</w:t>
+            </w:r>
+          </w:p>
+        </w:tc>
+      </w:tr>
+      <w:tr>
+        <w:trPr>
+          <w:cantSplit/>
+        </w:trPr>
+        <w:tc>
+          <w:tcPr>
+            <w:tcW w:type="dxa" w:w="5112"/>
+          </w:tcPr>
+          <w:p>
+            <w:r>
+              <w:t>Дополнительные тексты вакансий</w:t>
+            </w:r>
+          </w:p>
+        </w:tc>
+        <w:tc>
+          <w:tcPr>
+            <w:tcW w:type="dxa" w:w="5112"/>
+          </w:tcPr>
+          <w:p>
+            <w:r>
+              <w:t>29 998: словарь/IDF без искусственных меток пригодности</w:t>
+            </w:r>
+          </w:p>
+        </w:tc>
+      </w:tr>
+      <w:tr>
+        <w:trPr>
+          <w:cantSplit/>
+        </w:trPr>
+        <w:tc>
+          <w:tcPr>
+            <w:tcW w:type="dxa" w:w="5112"/>
+          </w:tcPr>
+          <w:p>
+            <w:r>
+              <w:t>Отдельный тест поиска</w:t>
+            </w:r>
+          </w:p>
+        </w:tc>
+        <w:tc>
+          <w:tcPr>
+            <w:tcW w:type="dxa" w:w="5112"/>
+          </w:tcPr>
+          <w:p>
+            <w:r>
+              <w:t>15 запросов, 862–1 817 человек на запрос, 2 806 версий текстов профилей</w:t>
+            </w:r>
+          </w:p>
+        </w:tc>
+      </w:tr>
+    </w:tbl>
+    <w:p>
+      <w:r>
+        <w:t>Метка 1 означает исходное «Принятие», 0 — «Отказ» по связанному ответу на отклик в течение 30 дней. Молчание, неоднозначная история и поздний ответ не становятся отрицательной меткой. Это наблюдаемый исход взаимодействия, а не экспертное заключение о навыках, качестве резюме или грейде. В приватных записях source_refs указывает CSV и номер записи после заголовка.</w:t>
+      </w:r>
+    </w:p>
+    <w:p>
+      <w:r>
+        <w:t>Тексты восстанавливаются до отклика. Разбиение групповое по связанным людям, CV, вакансиям и копиям; это не временное разбиение и не проверка на новых организациях. Возраст, пол, контакты и исходные ID не подаются как отдельные признаки. Очистка текста и хеширование ID не гарантируют полной анонимности. Экспертных разметчиков и внешней сертификации набора нет.</w:t>
+      </w:r>
+    </w:p>
+    <w:p>
+      <w:pPr>
+        <w:pStyle w:val="Heading2"/>
+      </w:pPr>
+      <w:r>
+        <w:t>Что обучали и что получилось</w:t>
+      </w:r>
+    </w:p>
+    <w:p>
+      <w:r>
+        <w:t>Обучались словари/IDF, линейные классификаторы, попарный ранжировщик и CatBoost YetiRank. Проверены cosine-базовые варианты и диагностический job-only. Готовый multilingual E5 small использовался локально с замороженными весами: сам трансформер на наших данных не дообучался. DeepSeek не использовался.</w:t>
+      </w:r>
+    </w:p>
+    <w:p>
+      <w:r>
+        <w:t>Первая серия выбрала word_cosine по заранее заданному резервному критерию AP на validation. Дополнительная V4-CV выбрала char_cosine по OOF AUC внутри вакансий: 0,6440. Последнее число служило выбору и не является независимой итоговой оценкой. V4-CV выполнена после просмотра первого test; её нельзя представлять новой слепой проверкой.</w:t>
+      </w:r>
+    </w:p>
+    <w:p>
+      <w:r>
+        <w:t>Основная NDCG@10 требует минимум десяти кандидатов и обоих известных исходов в группе вакансии. В test таких групп нет: основная метрика не определена. Есть три малые смешанные группы; NDCG на них — отдельная диагностическая метрика. Высокая общая AP тоже недостаточна: word_pair получил 0,9091, а модель без резюме job-only — 0,9285. Превосходство обученного ранжировщика для персонального подбора не доказано.</w:t>
+      </w:r>
+    </w:p>
+    <w:p>
+      <w:r>
+        <w:t>На отдельном пуле поиска Recall@100 замороженного E5 — 0,3792, word TF-IDF — 0,2750. Разница +10,42 п.п.; 95% bootstrap-интервал от −12,93 до +33,33 п.п. включает ноль. 15 запросов недостаточно для уверенного вывода о превосходстве. Неизвестные дополнительные CV не считались искусственными отказами.</w:t>
+      </w:r>
+    </w:p>
+    <w:p>
+      <w:pPr>
+        <w:pStyle w:val="Heading2"/>
+      </w:pPr>
+      <w:r>
+        <w:t>Воспроизводимость и передача</w:t>
+      </w:r>
+    </w:p>
+    <w:p>
+      <w:r>
+        <w:t>Полные результаты: dataset/training/RESULTS_V4.md; команды и контракт Ranker: dataset/training/README_V4.md; протоколы EXPERIMENT_V4.md и EXPERIMENT_V4_CV.md. Сохранённые предсказания всех 11 артефактов V4 и 6 V4-CV воспроизведены в новом процессе на 77 test-парах. Это replay сохранённых моделей, не повтор обучения. Записано 49 прошедших тестов контура. Эти проверки выполнены 10 октября; при обновлении документации они не запускались заново.</w:t>
+      </w:r>
+    </w:p>
+    <w:p>
+      <w:r>
+        <w:t>В GitHub публикуются код, агрегаты, карточки и SHA-манифесты. Реальные тексты, пообъектные связи, эмбеддинги и веса остаются в приватном dataset/builds/ и локальном архиве dataset/releases/trudvsem-training-2026-10-10-v4-local.zip. Существующий синтетический eval-пакет и внешние корпуса не объявляются размеченными реальными парами Trudvsem; V1–V3 сохранены отдельно.</w:t>
+      </w:r>
+    </w:p>
+    <w:p>
+      <w:r>
+        <w:t>Флаг production_promotion_allowed=false запрещает трактовать эксперимент как готовое основание автоматической замены подбора. Для внедрения нужны независимые достаточно большие смешанные списки по вакансиям, фиксированный протокол, сравнение внутри вакансий и проверка продуктового сценария после интеграции.</w:t>
+      </w:r>
+    </w:p>
+    <w:p>
+      <w:r>
+        <w:br w:type="page"/>
+      </w:r>
+    </w:p>
+    <w:p>
+      <w:pPr>
+        <w:pStyle w:val="Heading1"/>
+      </w:pPr>
+      <w:r>
+        <w:t>Фактические результаты проверки · 11 октября 2026</w:t>
+      </w:r>
+    </w:p>
+    <w:p>
+      <w:r>
+        <w:t>Последняя проверенная версия приложения — 785d362, банк 2.0.0, matching-1.1.0. Документ объединяет результаты разных дат с указанием границ. Обновление документации не означает повторного запуска всех перечисленных экспериментов. Первоначальный отчёт сохранён в VALIDATION_2026-10-07.md; его показатели относятся к старым версиям и не являются текущими метриками.</w:t>
+      </w:r>
+    </w:p>
+    <w:p>
+      <w:pPr>
+        <w:pStyle w:val="Heading2"/>
+      </w:pPr>
+      <w:r>
+        <w:t>Проверки платформы 11 октября</w:t>
       </w:r>
     </w:p>
     <w:tbl>
@@ -500,6 +1177,10 @@
         <w:gridCol w:w="3408"/>
       </w:tblGrid>
       <w:tr>
+        <w:trPr>
+          <w:tblHeader/>
+          <w:cantSplit/>
+        </w:trPr>
         <w:tc>
           <w:tcPr>
             <w:tcW w:type="dxa" w:w="3408"/>
@@ -532,13 +1213,16 @@
         </w:tc>
       </w:tr>
       <w:tr>
+        <w:trPr>
+          <w:cantSplit/>
+        </w:trPr>
         <w:tc>
           <w:tcPr>
             <w:tcW w:type="dxa" w:w="3408"/>
           </w:tcPr>
           <w:p>
             <w:r>
-              <w:t>Backend, правила, права, конкурентность</w:t>
+              <w:t>Серверные правила, права и регрессии</w:t>
             </w:r>
           </w:p>
         </w:tc>
@@ -548,7 +1232,7 @@
           </w:tcPr>
           <w:p>
             <w:r>
-              <w:t>python3 scripts/run_local.py .venv/bin/pytest -q tests</w:t>
+              <w:t>COOKIE_SECURE=false python3 scripts/run_local.py .venv/bin/pytest -q tests</w:t>
             </w:r>
           </w:p>
         </w:tc>
@@ -558,19 +1242,22 @@
           </w:tcPr>
           <w:p>
             <w:r>
-              <w:t>pass: 36 тестов; 2 предупреждения устаревания в инструментах тестирования</w:t>
+              <w:t>73 passed, 18,36 с, 2 предупреждения устаревших зависимостей</w:t>
             </w:r>
           </w:p>
         </w:tc>
       </w:tr>
       <w:tr>
+        <w:trPr>
+          <w:cantSplit/>
+        </w:trPr>
         <w:tc>
           <w:tcPr>
             <w:tcW w:type="dxa" w:w="3408"/>
           </w:tcPr>
           <w:p>
             <w:r>
-              <w:t>TypeScript + production build</w:t>
+              <w:t>Русские числительные</w:t>
             </w:r>
           </w:p>
         </w:tc>
@@ -580,7 +1267,7 @@
           </w:tcPr>
           <w:p>
             <w:r>
-              <w:t>cd apps/web &amp;&amp; npm run build</w:t>
+              <w:t>node apps/web/tests/formatting.test.mjs</w:t>
             </w:r>
           </w:p>
         </w:tc>
@@ -590,19 +1277,22 @@
           </w:tcPr>
           <w:p>
             <w:r>
-              <w:t>pass, 53 модуля, JS около 240 kB / 73 kB gzip</w:t>
+              <w:t>55 проверок: 11 значений × 5 счётчиков</w:t>
             </w:r>
           </w:p>
         </w:tc>
       </w:tr>
       <w:tr>
+        <w:trPr>
+          <w:cantSplit/>
+        </w:trPr>
         <w:tc>
           <w:tcPr>
             <w:tcW w:type="dxa" w:w="3408"/>
           </w:tcPr>
           <w:p>
             <w:r>
-              <w:t>Образы и запуск</w:t>
+              <w:t>Сборка</w:t>
             </w:r>
           </w:p>
         </w:tc>
@@ -612,7 +1302,7 @@
           </w:tcPr>
           <w:p>
             <w:r>
-              <w:t>docker compose build, docker compose up -d --wait</w:t>
+              <w:t>npm run build; финальная docker compose build api web</w:t>
             </w:r>
           </w:p>
         </w:tc>
@@ -622,19 +1312,22 @@
           </w:tcPr>
           <w:p>
             <w:r>
-              <w:t>pass, отдельный проект fsp-mvp, PostgreSQL/API доступны</w:t>
+              <w:t>TypeScript/Vite, API/web образы собраны</w:t>
             </w:r>
           </w:p>
         </w:tc>
       </w:tr>
       <w:tr>
+        <w:trPr>
+          <w:cantSplit/>
+        </w:trPr>
         <w:tc>
           <w:tcPr>
             <w:tcW w:type="dxa" w:w="3408"/>
           </w:tcPr>
           <w:p>
             <w:r>
-              <w:t>Новая БД, миграция, повтор seed</w:t>
+              <w:t>Исторические попытки, сквозной UI</w:t>
             </w:r>
           </w:p>
         </w:tc>
@@ -644,7 +1337,7 @@
           </w:tcPr>
           <w:p>
             <w:r>
-              <w:t>scripts/check_install.py</w:t>
+              <w:t>tests/browser_flow.py, --legacy-fixture, отдельная fsp_test</w:t>
             </w:r>
           </w:p>
         </w:tc>
@@ -654,19 +1347,22 @@
           </w:tcPr>
           <w:p>
             <w:r>
-              <w:t>pass: 14 таблиц, 15 пользователей после первого и второго seed, schema drift отсутствует</w:t>
+              <w:t>pass, 17,28 с; старые 4 и новые 8 вопросов</w:t>
             </w:r>
           </w:p>
         </w:tc>
       </w:tr>
       <w:tr>
+        <w:trPr>
+          <w:cantSplit/>
+        </w:trPr>
         <w:tc>
           <w:tcPr>
             <w:tcW w:type="dxa" w:w="3408"/>
           </w:tcPr>
           <w:p>
             <w:r>
-              <w:t>Сохранение данных при перезапуске</w:t>
+              <w:t>Полный путь по HTTPS</w:t>
             </w:r>
           </w:p>
         </w:tc>
@@ -676,7 +1372,7 @@
           </w:tcPr>
           <w:p>
             <w:r>
-              <w:t>scripts/check_restart.py, restart-results.json</w:t>
+              <w:t>tests/browser_flow.py на публичном домене</w:t>
             </w:r>
           </w:p>
         </w:tc>
@@ -686,19 +1382,22 @@
           </w:tcPr>
           <w:p>
             <w:r>
-              <w:t>результат и хеш строк зафиксированы в JSON</w:t>
+              <w:t>pass, 14,41 с, без ошибок JS</w:t>
             </w:r>
           </w:p>
         </w:tc>
       </w:tr>
       <w:tr>
+        <w:trPr>
+          <w:cantSplit/>
+        </w:trPr>
         <w:tc>
           <w:tcPr>
             <w:tcW w:type="dxa" w:w="3408"/>
           </w:tcPr>
           <w:p>
             <w:r>
-              <w:t>Chromium, desktop + mobile</w:t>
+              <w:t>Отрицательные сценарии и требования</w:t>
             </w:r>
           </w:p>
         </w:tc>
@@ -708,7 +1407,7 @@
           </w:tcPr>
           <w:p>
             <w:r>
-              <w:t>tests/browser_flow.py, browser-result.json</w:t>
+              <w:t>tests/browser_requirements.py --expect-core-rule</w:t>
             </w:r>
           </w:p>
         </w:tc>
@@ -718,135 +1417,7 @@
           </w:tcPr>
           <w:p>
             <w:r>
-              <w:t>сквозной сценарий без моков; отдельные синтетические регистрации</w:t>
-            </w:r>
-          </w:p>
-        </w:tc>
-      </w:tr>
-      <w:tr>
-        <w:tc>
-          <w:tcPr>
-            <w:tcW w:type="dxa" w:w="3408"/>
-          </w:tcPr>
-          <w:p>
-            <w:r>
-              <w:t>API-контракт</w:t>
-            </w:r>
-          </w:p>
-        </w:tc>
-        <w:tc>
-          <w:tcPr>
-            <w:tcW w:type="dxa" w:w="3408"/>
-          </w:tcPr>
-          <w:p>
-            <w:r>
-              <w:t>openapi.json из запущенного сервера</w:t>
-            </w:r>
-          </w:p>
-        </w:tc>
-        <w:tc>
-          <w:tcPr>
-            <w:tcW w:type="dxa" w:w="3408"/>
-          </w:tcPr>
-          <w:p>
-            <w:r>
-              <w:t>OpenAPI 3.1, 27 операций, 35 моделей, cookie/CSRF/ошибки/PDF</w:t>
-            </w:r>
-          </w:p>
-        </w:tc>
-      </w:tr>
-      <w:tr>
-        <w:tc>
-          <w:tcPr>
-            <w:tcW w:type="dxa" w:w="3408"/>
-          </w:tcPr>
-          <w:p>
-            <w:r>
-              <w:t>Зависимости frontend</w:t>
-            </w:r>
-          </w:p>
-        </w:tc>
-        <w:tc>
-          <w:tcPr>
-            <w:tcW w:type="dxa" w:w="3408"/>
-          </w:tcPr>
-          <w:p>
-            <w:r>
-              <w:t>npm audit --json</w:t>
-            </w:r>
-          </w:p>
-        </w:tc>
-        <w:tc>
-          <w:tcPr>
-            <w:tcW w:type="dxa" w:w="3408"/>
-          </w:tcPr>
-          <w:p>
-            <w:r>
-              <w:t>pass: известных уязвимостей на момент проверки не найдено</w:t>
-            </w:r>
-          </w:p>
-        </w:tc>
-      </w:tr>
-      <w:tr>
-        <w:tc>
-          <w:tcPr>
-            <w:tcW w:type="dxa" w:w="3408"/>
-          </w:tcPr>
-          <w:p>
-            <w:r>
-              <w:t>Зависимости backend</w:t>
-            </w:r>
-          </w:p>
-        </w:tc>
-        <w:tc>
-          <w:tcPr>
-            <w:tcW w:type="dxa" w:w="3408"/>
-          </w:tcPr>
-          <w:p>
-            <w:r>
-              <w:t>pip-audit -r apps/api/requirements.lock --no-deps --disable-pip</w:t>
-            </w:r>
-          </w:p>
-        </w:tc>
-        <w:tc>
-          <w:tcPr>
-            <w:tcW w:type="dxa" w:w="3408"/>
-          </w:tcPr>
-          <w:p>
-            <w:r>
-              <w:t>pass: известных уязвимостей на момент проверки не найдено</w:t>
-            </w:r>
-          </w:p>
-        </w:tc>
-      </w:tr>
-      <w:tr>
-        <w:tc>
-          <w:tcPr>
-            <w:tcW w:type="dxa" w:w="3408"/>
-          </w:tcPr>
-          <w:p>
-            <w:r>
-              <w:t>Нагрузка</w:t>
-            </w:r>
-          </w:p>
-        </w:tc>
-        <w:tc>
-          <w:tcPr>
-            <w:tcW w:type="dxa" w:w="3408"/>
-          </w:tcPr>
-          <w:p>
-            <w:r>
-              <w:t>tests/load_probe.py, load-results.json</w:t>
-            </w:r>
-          </w:p>
-        </w:tc>
-        <w:tc>
-          <w:tcPr>
-            <w:tcW w:type="dxa" w:w="3408"/>
-          </w:tcPr>
-          <w:p>
-            <w:r>
-              <w:t>pass: 270 запросов, 30 разных сессий/пользователей, 0 ошибок</w:t>
+              <w:t>18 проверок pass, 19,66 с; без ошибок JS/сервера</w:t>
             </w:r>
           </w:p>
         </w:tc>
@@ -854,12 +1425,27 @@
     </w:tbl>
     <w:p>
       <w:r>
-        <w:t>Интеграционные проверки выполнялись на настоящем PostgreSQL, в отдельной БД fsp_test. Проверены одноразовые/истёкшие токены, Argon2 и хешированные сессии, роли, подмена seed/score/grade, отсутствие эталона до сдачи, история, границы 24 часов и 90 дней, добровольное понижение и сохранение грейда при провале/истечении времени. Параллельные старты, сдачи, приглашения и принятия дают по одному результату и праву доступа.</w:t>
+        <w:t>Артефакты: docs/review/platform-fixes-2026-10-11/ — JSON результатов, checks.txt, SHA256SUMS, скриншоты. Подробный отчёт с командами и средой: docs/review/PLATFORM_FIXES_2026-10-11.md. Эти пути указаны от корня репозитория.</w:t>
       </w:r>
     </w:p>
     <w:p>
       <w:r>
-        <w:t>Проверены запреты чужому кандидату и второй компании: API, поиск, снимок, PDF с кириллицей, приглашения и чат. Контакты намеренно размещены в имени, телефоне и произвольных полях тестового профиля. До принятия они скрыты. Отзыв публикации закрывает доступ, скрытие стажа редактирует старые объяснения, повтор принятия после повторной публикации не возвращает старое разрешение. Нулевая/отрицательная/перевёрнутая вилка, дробные рубли, чужая валюта и пустое описание отвергаются. Подтверждение ФСП не меняет грейд.</w:t>
+        <w:t>Проверен путь: тест → результат → доказательства навыков → подбор → приглашение с зарплатой → принятие → раскрытие контактов → диалог. Отдельно проверены отказ другой компании, закрытый/открытый PDF, отзыв публикации, неизвестный React, отсутствие автоматического понижения и повышения за ФСП.</w:t>
+      </w:r>
+    </w:p>
+    <w:p>
+      <w:r>
+        <w:t>Проверено число заданий из сохранённого состава попытки и влияние восьмого ответа на итог. Исторические методики 1.0.0/1.1.0/1.2.0 сохраняют пороги; новая 2.0.0 не переоценивает их. Правила 24 часа / 90 дней действуют на сервере; UI заранее показывает причины и ближайшую дату. Счётчики проверены на 0, 1, 2, 4, 5, 11, 14, 21, 22, 25, 101.</w:t>
+      </w:r>
+    </w:p>
+    <w:p>
+      <w:r>
+        <w:t>UI запускался в Chromium/Playwright 1.52.0; затронутые экраны проверены при ширинах 360/390/768 px без горизонтального переполнения. Это эмуляция viewport, а не прогон всех реальных устройств, Firefox и Safari. Использованы новые вымышленные аккаунты; историческая фикстура создавалась только в тестовой БД.</w:t>
+      </w:r>
+    </w:p>
+    <w:p>
+      <w:r>
+        <w:t>Промежуточные проблемы (secure-cookie в HTTP TestClient, истёкшая тестовая сессия при перемотке времени, мобильное переполнение) раскрыты в отчёте и исправлены до указанных успешных прогонов. PDF визуально осмотрены; проверки содержимого и прав выполнялись автоматически.</w:t>
       </w:r>
     </w:p>
     <w:p>
@@ -867,198 +1453,17 @@
         <w:pStyle w:val="Heading2"/>
       </w:pPr>
       <w:r>
-        <w:t>Нагрузочный замер</w:t>
+        <w:t>PR.1: повторяемость и разделяющая сила</w:t>
       </w:r>
     </w:p>
     <w:p>
       <w:r>
-        <w:t>30 разных синтетических работодателей, по 9 запросов каждый, одновременно не более одного запроса от пользователя. 13 опубликованных профилей. Три круга чтения банка, карточки и PDF: всего 270 ответов 200 за 11,16 с, 24,19 запроса/с. Медиана общего времени 706 мс, p95 3040 мс.</w:t>
+        <w:t>Воспроизведён evaluation/bank_v2_audit.py: 42 000 симулированных попыток, 36 000 независимых сверок эталонов, 0 расхождений; сохранённые метрики в evaluation/bank_v2_results.json совпали. Протокол BANK_V2_PROTOCOL.md описывает повторные попытки, pairwise_agreement и сравнение сильного/слабого профиля по семействам. Ответ организаторов PR.1 допускает симуляцию.</w:t>
       </w:r>
     </w:p>
-    <w:tbl>
-      <w:tblPr>
-        <w:tblStyle w:val="LightShading-Accent1"/>
-        <w:tblW w:type="auto" w:w="0"/>
-        <w:tblLook w:firstColumn="1" w:firstRow="1" w:lastColumn="0" w:lastRow="0" w:noHBand="0" w:noVBand="1" w:val="04A0"/>
-      </w:tblPr>
-      <w:tblGrid>
-        <w:gridCol w:w="2556"/>
-        <w:gridCol w:w="2556"/>
-        <w:gridCol w:w="2556"/>
-        <w:gridCol w:w="2556"/>
-      </w:tblGrid>
-      <w:tr>
-        <w:tc>
-          <w:tcPr>
-            <w:tcW w:type="dxa" w:w="2556"/>
-          </w:tcPr>
-          <w:p>
-            <w:r>
-              <w:t>Операция</w:t>
-            </w:r>
-          </w:p>
-        </w:tc>
-        <w:tc>
-          <w:tcPr>
-            <w:tcW w:type="dxa" w:w="2556"/>
-          </w:tcPr>
-          <w:p>
-            <w:r>
-              <w:t>Запросов</w:t>
-            </w:r>
-          </w:p>
-        </w:tc>
-        <w:tc>
-          <w:tcPr>
-            <w:tcW w:type="dxa" w:w="2556"/>
-          </w:tcPr>
-          <w:p>
-            <w:r>
-              <w:t>Медиана, мс</w:t>
-            </w:r>
-          </w:p>
-        </w:tc>
-        <w:tc>
-          <w:tcPr>
-            <w:tcW w:type="dxa" w:w="2556"/>
-          </w:tcPr>
-          <w:p>
-            <w:r>
-              <w:t>p95, мс</w:t>
-            </w:r>
-          </w:p>
-        </w:tc>
-      </w:tr>
-      <w:tr>
-        <w:tc>
-          <w:tcPr>
-            <w:tcW w:type="dxa" w:w="2556"/>
-          </w:tcPr>
-          <w:p>
-            <w:r>
-              <w:t>Банк</w:t>
-            </w:r>
-          </w:p>
-        </w:tc>
-        <w:tc>
-          <w:tcPr>
-            <w:tcW w:type="dxa" w:w="2556"/>
-          </w:tcPr>
-          <w:p>
-            <w:r>
-              <w:t>90</w:t>
-            </w:r>
-          </w:p>
-        </w:tc>
-        <w:tc>
-          <w:tcPr>
-            <w:tcW w:type="dxa" w:w="2556"/>
-          </w:tcPr>
-          <w:p>
-            <w:r>
-              <w:t>2119,86</w:t>
-            </w:r>
-          </w:p>
-        </w:tc>
-        <w:tc>
-          <w:tcPr>
-            <w:tcW w:type="dxa" w:w="2556"/>
-          </w:tcPr>
-          <w:p>
-            <w:r>
-              <w:t>3196,42</w:t>
-            </w:r>
-          </w:p>
-        </w:tc>
-      </w:tr>
-      <w:tr>
-        <w:tc>
-          <w:tcPr>
-            <w:tcW w:type="dxa" w:w="2556"/>
-          </w:tcPr>
-          <w:p>
-            <w:r>
-              <w:t>Карточка</w:t>
-            </w:r>
-          </w:p>
-        </w:tc>
-        <w:tc>
-          <w:tcPr>
-            <w:tcW w:type="dxa" w:w="2556"/>
-          </w:tcPr>
-          <w:p>
-            <w:r>
-              <w:t>90</w:t>
-            </w:r>
-          </w:p>
-        </w:tc>
-        <w:tc>
-          <w:tcPr>
-            <w:tcW w:type="dxa" w:w="2556"/>
-          </w:tcPr>
-          <w:p>
-            <w:r>
-              <w:t>514,20</w:t>
-            </w:r>
-          </w:p>
-        </w:tc>
-        <w:tc>
-          <w:tcPr>
-            <w:tcW w:type="dxa" w:w="2556"/>
-          </w:tcPr>
-          <w:p>
-            <w:r>
-              <w:t>796,52</w:t>
-            </w:r>
-          </w:p>
-        </w:tc>
-      </w:tr>
-      <w:tr>
-        <w:tc>
-          <w:tcPr>
-            <w:tcW w:type="dxa" w:w="2556"/>
-          </w:tcPr>
-          <w:p>
-            <w:r>
-              <w:t>PDF</w:t>
-            </w:r>
-          </w:p>
-        </w:tc>
-        <w:tc>
-          <w:tcPr>
-            <w:tcW w:type="dxa" w:w="2556"/>
-          </w:tcPr>
-          <w:p>
-            <w:r>
-              <w:t>90</w:t>
-            </w:r>
-          </w:p>
-        </w:tc>
-        <w:tc>
-          <w:tcPr>
-            <w:tcW w:type="dxa" w:w="2556"/>
-          </w:tcPr>
-          <w:p>
-            <w:r>
-              <w:t>630,00</w:t>
-            </w:r>
-          </w:p>
-        </w:tc>
-        <w:tc>
-          <w:tcPr>
-            <w:tcW w:type="dxa" w:w="2556"/>
-          </w:tcPr>
-          <w:p>
-            <w:r>
-              <w:t>866,41</w:t>
-            </w:r>
-          </w:p>
-        </w:tc>
-      </w:tr>
-    </w:tbl>
     <w:p>
       <w:r>
-        <w:t>Сессии для этого замера созданы как явные тестовые данные в БД; регистрация и почта не включены в нагрузку. Нет измерения долгого потока, записи или большого корпуса. Задержка банка около 3,2 с на p95 — оставшееся ограничение N+1 и полной выдачи, а не доказательство готовности к промышленному масштабу.</w:t>
+        <w:t>Сильные и слабые профили заданы моделью, а повторные пары не являются независимыми участниками. Это не доказанная психометрическая валидность. Human pilot: not_run, 0 участников, 0 попыток, 0 пар. Инструменты и порядок реального пилота — HUMAN_PILOT.md. Один удачный тест не подтверждает PR.1.</w:t>
       </w:r>
     </w:p>
     <w:p>
@@ -1066,296 +1471,12 @@
         <w:pStyle w:val="Heading2"/>
       </w:pPr>
       <w:r>
-        <w:t>Независимые вычисления и синтетические уровни</w:t>
+        <w:t>Обучение на реальных данных</w:t>
       </w:r>
     </w:p>
     <w:p>
       <w:r>
-        <w:t>Протокол зафиксирован до финального измерения. evaluation/oracles.py не импортирует генератор или оценщик. Unit-набор проверяет 600 уникальных вариантов, 2400 вопросов по 6 категориям; воспроизводимость и blueprint. Отдельная оценка содержит 12 синтетических персон, 20 вариантов для каждой, 3 уровня: 720 уникальных попыток и 2880 проверок эталона независимым решением.</w:t>
-      </w:r>
-    </w:p>
-    <w:p>
-      <w:r>
-        <w:t>Для персон заранее заданы известные семейства и ожидаемый уровень; у двух «noisy-middle» дополнительно вероятность ошибки 0,2. Получено 235/240 совпадений ожидаемого уровня: 97,92%. Средняя доля наиболее частого результата по вариантам — 97,92%. Это симуляция правила, не доля правильно оценённых реальных программистов.</w:t>
-      </w:r>
-    </w:p>
-    <w:tbl>
-      <w:tblPr>
-        <w:tblStyle w:val="LightShading-Accent1"/>
-        <w:tblW w:type="auto" w:w="0"/>
-        <w:tblLook w:firstColumn="1" w:firstRow="1" w:lastColumn="0" w:lastRow="0" w:noHBand="0" w:noVBand="1" w:val="04A0"/>
-      </w:tblPr>
-      <w:tblGrid>
-        <w:gridCol w:w="2045"/>
-        <w:gridCol w:w="2045"/>
-        <w:gridCol w:w="2045"/>
-        <w:gridCol w:w="2045"/>
-        <w:gridCol w:w="2045"/>
-      </w:tblGrid>
-      <w:tr>
-        <w:tc>
-          <w:tcPr>
-            <w:tcW w:type="dxa" w:w="2045"/>
-          </w:tcPr>
-          <w:p>
-            <w:r>
-              <w:t>Ожидаемый → полученный</w:t>
-            </w:r>
-          </w:p>
-        </w:tc>
-        <w:tc>
-          <w:tcPr>
-            <w:tcW w:type="dxa" w:w="2045"/>
-          </w:tcPr>
-          <w:p>
-            <w:r>
-              <w:t>Не подтверждён</w:t>
-            </w:r>
-          </w:p>
-        </w:tc>
-        <w:tc>
-          <w:tcPr>
-            <w:tcW w:type="dxa" w:w="2045"/>
-          </w:tcPr>
-          <w:p>
-            <w:r>
-              <w:t>Junior</w:t>
-            </w:r>
-          </w:p>
-        </w:tc>
-        <w:tc>
-          <w:tcPr>
-            <w:tcW w:type="dxa" w:w="2045"/>
-          </w:tcPr>
-          <w:p>
-            <w:r>
-              <w:t>Middle</w:t>
-            </w:r>
-          </w:p>
-        </w:tc>
-        <w:tc>
-          <w:tcPr>
-            <w:tcW w:type="dxa" w:w="2045"/>
-          </w:tcPr>
-          <w:p>
-            <w:r>
-              <w:t>Senior</w:t>
-            </w:r>
-          </w:p>
-        </w:tc>
-      </w:tr>
-      <w:tr>
-        <w:tc>
-          <w:tcPr>
-            <w:tcW w:type="dxa" w:w="2045"/>
-          </w:tcPr>
-          <w:p>
-            <w:r>
-              <w:t>Не подтверждён</w:t>
-            </w:r>
-          </w:p>
-        </w:tc>
-        <w:tc>
-          <w:tcPr>
-            <w:tcW w:type="dxa" w:w="2045"/>
-          </w:tcPr>
-          <w:p>
-            <w:r>
-              <w:t>80</w:t>
-            </w:r>
-          </w:p>
-        </w:tc>
-        <w:tc>
-          <w:tcPr>
-            <w:tcW w:type="dxa" w:w="2045"/>
-          </w:tcPr>
-          <w:p>
-            <w:r>
-              <w:t>0</w:t>
-            </w:r>
-          </w:p>
-        </w:tc>
-        <w:tc>
-          <w:tcPr>
-            <w:tcW w:type="dxa" w:w="2045"/>
-          </w:tcPr>
-          <w:p>
-            <w:r>
-              <w:t>0</w:t>
-            </w:r>
-          </w:p>
-        </w:tc>
-        <w:tc>
-          <w:tcPr>
-            <w:tcW w:type="dxa" w:w="2045"/>
-          </w:tcPr>
-          <w:p>
-            <w:r>
-              <w:t>0</w:t>
-            </w:r>
-          </w:p>
-        </w:tc>
-      </w:tr>
-      <w:tr>
-        <w:tc>
-          <w:tcPr>
-            <w:tcW w:type="dxa" w:w="2045"/>
-          </w:tcPr>
-          <w:p>
-            <w:r>
-              <w:t>Junior</w:t>
-            </w:r>
-          </w:p>
-        </w:tc>
-        <w:tc>
-          <w:tcPr>
-            <w:tcW w:type="dxa" w:w="2045"/>
-          </w:tcPr>
-          <w:p>
-            <w:r>
-              <w:t>0</w:t>
-            </w:r>
-          </w:p>
-        </w:tc>
-        <w:tc>
-          <w:tcPr>
-            <w:tcW w:type="dxa" w:w="2045"/>
-          </w:tcPr>
-          <w:p>
-            <w:r>
-              <w:t>40</w:t>
-            </w:r>
-          </w:p>
-        </w:tc>
-        <w:tc>
-          <w:tcPr>
-            <w:tcW w:type="dxa" w:w="2045"/>
-          </w:tcPr>
-          <w:p>
-            <w:r>
-              <w:t>0</w:t>
-            </w:r>
-          </w:p>
-        </w:tc>
-        <w:tc>
-          <w:tcPr>
-            <w:tcW w:type="dxa" w:w="2045"/>
-          </w:tcPr>
-          <w:p>
-            <w:r>
-              <w:t>0</w:t>
-            </w:r>
-          </w:p>
-        </w:tc>
-      </w:tr>
-      <w:tr>
-        <w:tc>
-          <w:tcPr>
-            <w:tcW w:type="dxa" w:w="2045"/>
-          </w:tcPr>
-          <w:p>
-            <w:r>
-              <w:t>Middle</w:t>
-            </w:r>
-          </w:p>
-        </w:tc>
-        <w:tc>
-          <w:tcPr>
-            <w:tcW w:type="dxa" w:w="2045"/>
-          </w:tcPr>
-          <w:p>
-            <w:r>
-              <w:t>2</w:t>
-            </w:r>
-          </w:p>
-        </w:tc>
-        <w:tc>
-          <w:tcPr>
-            <w:tcW w:type="dxa" w:w="2045"/>
-          </w:tcPr>
-          <w:p>
-            <w:r>
-              <w:t>3</w:t>
-            </w:r>
-          </w:p>
-        </w:tc>
-        <w:tc>
-          <w:tcPr>
-            <w:tcW w:type="dxa" w:w="2045"/>
-          </w:tcPr>
-          <w:p>
-            <w:r>
-              <w:t>75</w:t>
-            </w:r>
-          </w:p>
-        </w:tc>
-        <w:tc>
-          <w:tcPr>
-            <w:tcW w:type="dxa" w:w="2045"/>
-          </w:tcPr>
-          <w:p>
-            <w:r>
-              <w:t>0</w:t>
-            </w:r>
-          </w:p>
-        </w:tc>
-      </w:tr>
-      <w:tr>
-        <w:tc>
-          <w:tcPr>
-            <w:tcW w:type="dxa" w:w="2045"/>
-          </w:tcPr>
-          <w:p>
-            <w:r>
-              <w:t>Senior</w:t>
-            </w:r>
-          </w:p>
-        </w:tc>
-        <w:tc>
-          <w:tcPr>
-            <w:tcW w:type="dxa" w:w="2045"/>
-          </w:tcPr>
-          <w:p>
-            <w:r>
-              <w:t>0</w:t>
-            </w:r>
-          </w:p>
-        </w:tc>
-        <w:tc>
-          <w:tcPr>
-            <w:tcW w:type="dxa" w:w="2045"/>
-          </w:tcPr>
-          <w:p>
-            <w:r>
-              <w:t>0</w:t>
-            </w:r>
-          </w:p>
-        </w:tc>
-        <w:tc>
-          <w:tcPr>
-            <w:tcW w:type="dxa" w:w="2045"/>
-          </w:tcPr>
-          <w:p>
-            <w:r>
-              <w:t>0</w:t>
-            </w:r>
-          </w:p>
-        </w:tc>
-        <w:tc>
-          <w:tcPr>
-            <w:tcW w:type="dxa" w:w="2045"/>
-          </w:tcPr>
-          <w:p>
-            <w:r>
-              <w:t>40</w:t>
-            </w:r>
-          </w:p>
-        </w:tc>
-      </w:tr>
-    </w:tbl>
-    <w:p>
-      <w:r>
-        <w:t>Пять ошибок — чувствительность короткого теста к случайным пропускам у синтетических Middle. Четыре вопроса не дают надёжной оценки человека по всем компетенциям уровня. Эту слабость нельзя устранить заявлением о «равной сложности» параметрических вариантов; нужен пилот и более широкий банк.</w:t>
+        <w:t>Результаты V4/V4-CV от 10 октября приведены в DATA_AND_MODELS.md и полностью в dataset/training/RESULTS_V4.md. Основная NDCG@10 не определена из-за отсутствия достаточно больших смешанных test-групп; доказанного улучшения для внедрения нет. Числа синтетического подбора раннего MVP (например, P@5 = 0,80) не являются качеством V4 на реальных людях.</w:t>
       </w:r>
     </w:p>
     <w:p>
@@ -1363,413 +1484,17 @@
         <w:pStyle w:val="Heading2"/>
       </w:pPr>
       <w:r>
-        <w:t>Качество подбора</w:t>
+        <w:t>Исторические проверки и оставшиеся ограничения</w:t>
       </w:r>
     </w:p>
     <w:p>
       <w:r>
-        <w:t>Train отсутствует: модель не обучается, веса фиксированы. Dev: 16 профилей, 2 запроса. Test: 48 профилей, 8 запросов, другие ID. Это разные вымышленные персоны, но специально повторяемые типы ошибок и категории; статистической независимости выборки реальных людей эти данные не обеспечивают. Явные relevance labels хранятся в fixture, не получены вызовом rank_candidate. Автор разметки — разработка; независимых экспертов ФСП: 0.</w:t>
+        <w:t>Установка в новую БД, повтор seed, перезапуск, аудит зависимостей и нагрузка зафиксированы в install-results.json, restart-results.json, dependency-audit.json, load-results.json и старом release-checks.json. Это свидетельства прежней сборки, а не повторный аудит от 11 октября. Старый нагрузочный замер: 30 пользователей, 270 чтений, 0 ошибок, p95 3,04 с на небольшом демонаборе. Масштабирование на миллионы CV этим не проверено.</w:t>
       </w:r>
     </w:p>
     <w:p>
       <w:r>
-        <w:t>Baseline: пересечение заявленных навыков и стаж внутри той же категории. P@5 всегда делит число релевантных в первых пяти на 5, даже при нехватке релевантных кандидатов. Это намеренно сурово к пустой выдаче и коротким спискам.</w:t>
-      </w:r>
-    </w:p>
-    <w:tbl>
-      <w:tblPr>
-        <w:tblStyle w:val="LightShading-Accent1"/>
-        <w:tblW w:type="auto" w:w="0"/>
-        <w:tblLook w:firstColumn="1" w:firstRow="1" w:lastColumn="0" w:lastRow="0" w:noHBand="0" w:noVBand="1" w:val="04A0"/>
-      </w:tblPr>
-      <w:tblGrid>
-        <w:gridCol w:w="3408"/>
-        <w:gridCol w:w="3408"/>
-        <w:gridCol w:w="3408"/>
-      </w:tblGrid>
-      <w:tr>
-        <w:tc>
-          <w:tcPr>
-            <w:tcW w:type="dxa" w:w="3408"/>
-          </w:tcPr>
-          <w:p>
-            <w:r>
-              <w:t>Запрос test</w:t>
-            </w:r>
-          </w:p>
-        </w:tc>
-        <w:tc>
-          <w:tcPr>
-            <w:tcW w:type="dxa" w:w="3408"/>
-          </w:tcPr>
-          <w:p>
-            <w:r>
-              <w:t>P@5 MVP</w:t>
-            </w:r>
-          </w:p>
-        </w:tc>
-        <w:tc>
-          <w:tcPr>
-            <w:tcW w:type="dxa" w:w="3408"/>
-          </w:tcPr>
-          <w:p>
-            <w:r>
-              <w:t>P@5 baseline</w:t>
-            </w:r>
-          </w:p>
-        </w:tc>
-      </w:tr>
-      <w:tr>
-        <w:tc>
-          <w:tcPr>
-            <w:tcW w:type="dxa" w:w="3408"/>
-          </w:tcPr>
-          <w:p>
-            <w:r>
-              <w:t>Python Junior</w:t>
-            </w:r>
-          </w:p>
-        </w:tc>
-        <w:tc>
-          <w:tcPr>
-            <w:tcW w:type="dxa" w:w="3408"/>
-          </w:tcPr>
-          <w:p>
-            <w:r>
-              <w:t>1,00</w:t>
-            </w:r>
-          </w:p>
-        </w:tc>
-        <w:tc>
-          <w:tcPr>
-            <w:tcW w:type="dxa" w:w="3408"/>
-          </w:tcPr>
-          <w:p>
-            <w:r>
-              <w:t>0,60</w:t>
-            </w:r>
-          </w:p>
-        </w:tc>
-      </w:tr>
-      <w:tr>
-        <w:tc>
-          <w:tcPr>
-            <w:tcW w:type="dxa" w:w="3408"/>
-          </w:tcPr>
-          <w:p>
-            <w:r>
-              <w:t>Python Middle</w:t>
-            </w:r>
-          </w:p>
-        </w:tc>
-        <w:tc>
-          <w:tcPr>
-            <w:tcW w:type="dxa" w:w="3408"/>
-          </w:tcPr>
-          <w:p>
-            <w:r>
-              <w:t>1,00</w:t>
-            </w:r>
-          </w:p>
-        </w:tc>
-        <w:tc>
-          <w:tcPr>
-            <w:tcW w:type="dxa" w:w="3408"/>
-          </w:tcPr>
-          <w:p>
-            <w:r>
-              <w:t>0,60</w:t>
-            </w:r>
-          </w:p>
-        </w:tc>
-      </w:tr>
-      <w:tr>
-        <w:tc>
-          <w:tcPr>
-            <w:tcW w:type="dxa" w:w="3408"/>
-          </w:tcPr>
-          <w:p>
-            <w:r>
-              <w:t>Python Senior</w:t>
-            </w:r>
-          </w:p>
-        </w:tc>
-        <w:tc>
-          <w:tcPr>
-            <w:tcW w:type="dxa" w:w="3408"/>
-          </w:tcPr>
-          <w:p>
-            <w:r>
-              <w:t>1,00</w:t>
-            </w:r>
-          </w:p>
-        </w:tc>
-        <w:tc>
-          <w:tcPr>
-            <w:tcW w:type="dxa" w:w="3408"/>
-          </w:tcPr>
-          <w:p>
-            <w:r>
-              <w:t>0,60</w:t>
-            </w:r>
-          </w:p>
-        </w:tc>
-      </w:tr>
-      <w:tr>
-        <w:tc>
-          <w:tcPr>
-            <w:tcW w:type="dxa" w:w="3408"/>
-          </w:tcPr>
-          <w:p>
-            <w:r>
-              <w:t>Data Junior</w:t>
-            </w:r>
-          </w:p>
-        </w:tc>
-        <w:tc>
-          <w:tcPr>
-            <w:tcW w:type="dxa" w:w="3408"/>
-          </w:tcPr>
-          <w:p>
-            <w:r>
-              <w:t>1,00</w:t>
-            </w:r>
-          </w:p>
-        </w:tc>
-        <w:tc>
-          <w:tcPr>
-            <w:tcW w:type="dxa" w:w="3408"/>
-          </w:tcPr>
-          <w:p>
-            <w:r>
-              <w:t>0,60</w:t>
-            </w:r>
-          </w:p>
-        </w:tc>
-      </w:tr>
-      <w:tr>
-        <w:tc>
-          <w:tcPr>
-            <w:tcW w:type="dxa" w:w="3408"/>
-          </w:tcPr>
-          <w:p>
-            <w:r>
-              <w:t>Data Middle</w:t>
-            </w:r>
-          </w:p>
-        </w:tc>
-        <w:tc>
-          <w:tcPr>
-            <w:tcW w:type="dxa" w:w="3408"/>
-          </w:tcPr>
-          <w:p>
-            <w:r>
-              <w:t>1,00</w:t>
-            </w:r>
-          </w:p>
-        </w:tc>
-        <w:tc>
-          <w:tcPr>
-            <w:tcW w:type="dxa" w:w="3408"/>
-          </w:tcPr>
-          <w:p>
-            <w:r>
-              <w:t>0,60</w:t>
-            </w:r>
-          </w:p>
-        </w:tc>
-      </w:tr>
-      <w:tr>
-        <w:tc>
-          <w:tcPr>
-            <w:tcW w:type="dxa" w:w="3408"/>
-          </w:tcPr>
-          <w:p>
-            <w:r>
-              <w:t>Data Senior</w:t>
-            </w:r>
-          </w:p>
-        </w:tc>
-        <w:tc>
-          <w:tcPr>
-            <w:tcW w:type="dxa" w:w="3408"/>
-          </w:tcPr>
-          <w:p>
-            <w:r>
-              <w:t>1,00</w:t>
-            </w:r>
-          </w:p>
-        </w:tc>
-        <w:tc>
-          <w:tcPr>
-            <w:tcW w:type="dxa" w:w="3408"/>
-          </w:tcPr>
-          <w:p>
-            <w:r>
-              <w:t>0,60</w:t>
-            </w:r>
-          </w:p>
-        </w:tc>
-      </w:tr>
-      <w:tr>
-        <w:tc>
-          <w:tcPr>
-            <w:tcW w:type="dxa" w:w="3408"/>
-          </w:tcPr>
-          <w:p>
-            <w:r>
-              <w:t>Python + React без доказательства React</w:t>
-            </w:r>
-          </w:p>
-        </w:tc>
-        <w:tc>
-          <w:tcPr>
-            <w:tcW w:type="dxa" w:w="3408"/>
-          </w:tcPr>
-          <w:p>
-            <w:r>
-              <w:t>0,00</w:t>
-            </w:r>
-          </w:p>
-        </w:tc>
-        <w:tc>
-          <w:tcPr>
-            <w:tcW w:type="dxa" w:w="3408"/>
-          </w:tcPr>
-          <w:p>
-            <w:r>
-              <w:t>0,00</w:t>
-            </w:r>
-          </w:p>
-        </w:tc>
-      </w:tr>
-      <w:tr>
-        <w:tc>
-          <w:tcPr>
-            <w:tcW w:type="dxa" w:w="3408"/>
-          </w:tcPr>
-          <w:p>
-            <w:r>
-              <w:t>Python + обязательное тестирование</w:t>
-            </w:r>
-          </w:p>
-        </w:tc>
-        <w:tc>
-          <w:tcPr>
-            <w:tcW w:type="dxa" w:w="3408"/>
-          </w:tcPr>
-          <w:p>
-            <w:r>
-              <w:t>0,40</w:t>
-            </w:r>
-          </w:p>
-        </w:tc>
-        <w:tc>
-          <w:tcPr>
-            <w:tcW w:type="dxa" w:w="3408"/>
-          </w:tcPr>
-          <w:p>
-            <w:r>
-              <w:t>0,20</w:t>
-            </w:r>
-          </w:p>
-        </w:tc>
-      </w:tr>
-      <w:tr>
-        <w:tc>
-          <w:tcPr>
-            <w:tcW w:type="dxa" w:w="3408"/>
-          </w:tcPr>
-          <w:p>
-            <w:r>
-              <w:t>Среднее</w:t>
-            </w:r>
-          </w:p>
-        </w:tc>
-        <w:tc>
-          <w:tcPr>
-            <w:tcW w:type="dxa" w:w="3408"/>
-          </w:tcPr>
-          <w:p>
-            <w:r>
-              <w:t>0,80</w:t>
-            </w:r>
-          </w:p>
-        </w:tc>
-        <w:tc>
-          <w:tcPr>
-            <w:tcW w:type="dxa" w:w="3408"/>
-          </w:tcPr>
-          <w:p>
-            <w:r>
-              <w:t>0,475</w:t>
-            </w:r>
-          </w:p>
-        </w:tc>
-      </w:tr>
-    </w:tbl>
-    <w:p>
-      <w:r>
-        <w:t>В шести простых случаях доказательства вытесняют громкие самодекларации. В запросе React все пять выдаваемых карточек нерелевантны по разметке; интерфейс честно показывает unknown, но выдача всё равно заполнена. В запросе с двумя обязательными навыками есть только два полностью релевантных кандидата; оставшиеся три получают неполное соответствие. Эти ошибки сохранены в evaluation/results.json. Веса после просмотра test не перенастраивались.</w:t>
-      </w:r>
-    </w:p>
-    <w:p>
-      <w:pPr>
-        <w:pStyle w:val="Heading2"/>
-      </w:pPr>
-      <w:r>
-        <w:t>Найденные и исправленные проблемы</w:t>
-      </w:r>
-    </w:p>
-    <w:p>
-      <w:r>
-        <w:t>- Черновое семейство граничных условий всегда имело ответ 2. В 1.1.0 набор   входов меняется содержательно; независимый oracle проверяет расхождения.</w:t>
-      </w:r>
-    </w:p>
-    <w:p>
-      <w:r>
-        <w:t>- Историческое объяснение могло раскрыть скрытый позже стаж: теперь оно   проверяет актуальную настройку при каждом чтении.</w:t>
-      </w:r>
-    </w:p>
-    <w:p>
-      <w:r>
-        <w:t>- Первое выполнение проверки 90 дней вернуло 401: истекла тестовая сессия.   Исправлен тест часов с явным продлением своей сессии; правило API не ослаблено.</w:t>
-      </w:r>
-    </w:p>
-    <w:p>
-      <w:r>
-        <w:t>- Первоначальная frontend-сборка завершилась 137 из-за памяти. Отдельно   найден рекурсивный анализ Rollup; настройка сборки исправлена и перепроверена.</w:t>
-      </w:r>
-    </w:p>
-    <w:p>
-      <w:r>
-        <w:t>- npm audit обнаружил проблему Vite 6.4.1; обновлён до 6.4.4.   pip-audit обнаружил 7 записей у Starlette 0.46.2; FastAPI/Starlette обновлены   до 0.142.3/1.3.1, полный набор тестов повторён. Финальные сканы чистые   относительно доступных им баз, не являются полным аудитом безопасности.</w:t>
-      </w:r>
-    </w:p>
-    <w:p>
-      <w:pPr>
-        <w:pStyle w:val="Heading2"/>
-      </w:pPr>
-      <w:r>
-        <w:t>Сохранность исходных материалов</w:t>
-      </w:r>
-    </w:p>
-    <w:p>
-      <w:r>
-        <w:t>python3 scripts/verify_workspace.py --inputs-only: 8141 исходный файл совпадает с предоставленными SHA-256; 8131 архивный путь разрешён через фактический вложенный каталог fsp_mvp_bundle. 22 редактируемых рабочих файла исключены из этой проверки. Первоначальный запуск без учёта вложенности дал ложные missing и ожидаемые отличия рабочих документов; это исправление пути проверки, а не восстановление или перезапись исходников. Хеширование не объявляется содержательным чтением.</w:t>
-      </w:r>
-    </w:p>
-    <w:p>
-      <w:pPr>
-        <w:pStyle w:val="Heading2"/>
-      </w:pPr>
-      <w:r>
-        <w:t>Не запускалось / не подтверждено</w:t>
-      </w:r>
-    </w:p>
-    <w:p>
-      <w:r>
-        <w:t>Реальная доставка SMTP, внешний ФСП/Keycloak, публичный HTTPS-домен, экспертная разметка и пилот с людьми, прокторинг и защищённый промышленный режим обработки персональных данных. Нет утверждения о завершённом чтении всех файлов исходной подборки: реальные статусы сохранены в docs/review.</w:t>
+        <w:t>Реальный SMTP, ФСП/Keycloak, человеческий пилот, экспертная разметка, прокторинг, производственная аттестация и полное чтение стороннего архива не подтверждены. Публичный HTTPS работает и проверен; прежняя фраза об отсутствии домена более не актуальна. E09 — отдельные регулярные задания работодателя — не реализован; план включён в текущий отчёт и матрицу.</w:t>
       </w:r>
     </w:p>
     <w:p>
@@ -1782,7 +1507,12 @@
         <w:pStyle w:val="Heading1"/>
       </w:pPr>
       <w:r>
-        <w:t>Итоговая матрица соответствия</w:t>
+        <w:t>Итоговая матрица соответствия · 11 октября 2026</w:t>
+      </w:r>
+    </w:p>
+    <w:p>
+      <w:r>
+        <w:t>Приложение 785d362; банк 2.0.0; подбор matching-1.1.0.</w:t>
       </w:r>
     </w:p>
     <w:p>
@@ -1803,6 +1533,10 @@
         <w:gridCol w:w="2556"/>
       </w:tblGrid>
       <w:tr>
+        <w:trPr>
+          <w:tblHeader/>
+          <w:cantSplit/>
+        </w:trPr>
         <w:tc>
           <w:tcPr>
             <w:tcW w:type="dxa" w:w="2556"/>
@@ -1845,6 +1579,9 @@
         </w:tc>
       </w:tr>
       <w:tr>
+        <w:trPr>
+          <w:cantSplit/>
+        </w:trPr>
         <w:tc>
           <w:tcPr>
             <w:tcW w:type="dxa" w:w="2556"/>
@@ -1887,6 +1624,9 @@
         </w:tc>
       </w:tr>
       <w:tr>
+        <w:trPr>
+          <w:cantSplit/>
+        </w:trPr>
         <w:tc>
           <w:tcPr>
             <w:tcW w:type="dxa" w:w="2556"/>
@@ -1929,6 +1669,9 @@
         </w:tc>
       </w:tr>
       <w:tr>
+        <w:trPr>
+          <w:cantSplit/>
+        </w:trPr>
         <w:tc>
           <w:tcPr>
             <w:tcW w:type="dxa" w:w="2556"/>
@@ -1971,6 +1714,9 @@
         </w:tc>
       </w:tr>
       <w:tr>
+        <w:trPr>
+          <w:cantSplit/>
+        </w:trPr>
         <w:tc>
           <w:tcPr>
             <w:tcW w:type="dxa" w:w="2556"/>
@@ -2013,6 +1759,9 @@
         </w:tc>
       </w:tr>
       <w:tr>
+        <w:trPr>
+          <w:cantSplit/>
+        </w:trPr>
         <w:tc>
           <w:tcPr>
             <w:tcW w:type="dxa" w:w="2556"/>
@@ -2055,6 +1804,9 @@
         </w:tc>
       </w:tr>
       <w:tr>
+        <w:trPr>
+          <w:cantSplit/>
+        </w:trPr>
         <w:tc>
           <w:tcPr>
             <w:tcW w:type="dxa" w:w="2556"/>
@@ -2071,7 +1823,7 @@
           </w:tcPr>
           <w:p>
             <w:r>
-              <w:t>12 семейств, fingerprint, oracle</w:t>
+              <w:t>24 семейства, 8 заданий, версии и oracle</w:t>
             </w:r>
           </w:p>
         </w:tc>
@@ -2081,7 +1833,7 @@
           </w:tcPr>
           <w:p>
             <w:r>
-              <w:t>600 unit-вариантов + 720 вариантов оценки; 2880 независимых проверок в evaluation</w:t>
+              <w:t>42 000 симулированных попыток, 36 000 сверок, 0 расхождений; повторено 11 октября</w:t>
             </w:r>
           </w:p>
         </w:tc>
@@ -2091,12 +1843,15 @@
           </w:tcPr>
           <w:p>
             <w:r>
-              <w:t>реализовано; психометрическая сопоставимость на людях not_run</w:t>
+              <w:t>реализовано в пределах симуляции; человеческая психометрика not_run</w:t>
             </w:r>
           </w:p>
         </w:tc>
       </w:tr>
       <w:tr>
+        <w:trPr>
+          <w:cantSplit/>
+        </w:trPr>
         <w:tc>
           <w:tcPr>
             <w:tcW w:type="dxa" w:w="2556"/>
@@ -2139,6 +1894,9 @@
         </w:tc>
       </w:tr>
       <w:tr>
+        <w:trPr>
+          <w:cantSplit/>
+        </w:trPr>
         <w:tc>
           <w:tcPr>
             <w:tcW w:type="dxa" w:w="2556"/>
@@ -2181,6 +1939,9 @@
         </w:tc>
       </w:tr>
       <w:tr>
+        <w:trPr>
+          <w:cantSplit/>
+        </w:trPr>
         <w:tc>
           <w:tcPr>
             <w:tcW w:type="dxa" w:w="2556"/>
@@ -2223,6 +1984,9 @@
         </w:tc>
       </w:tr>
       <w:tr>
+        <w:trPr>
+          <w:cantSplit/>
+        </w:trPr>
         <w:tc>
           <w:tcPr>
             <w:tcW w:type="dxa" w:w="2556"/>
@@ -2265,6 +2029,9 @@
         </w:tc>
       </w:tr>
       <w:tr>
+        <w:trPr>
+          <w:cantSplit/>
+        </w:trPr>
         <w:tc>
           <w:tcPr>
             <w:tcW w:type="dxa" w:w="2556"/>
@@ -2307,6 +2074,9 @@
         </w:tc>
       </w:tr>
       <w:tr>
+        <w:trPr>
+          <w:cantSplit/>
+        </w:trPr>
         <w:tc>
           <w:tcPr>
             <w:tcW w:type="dxa" w:w="2556"/>
@@ -2349,6 +2119,9 @@
         </w:tc>
       </w:tr>
       <w:tr>
+        <w:trPr>
+          <w:cantSplit/>
+        </w:trPr>
         <w:tc>
           <w:tcPr>
             <w:tcW w:type="dxa" w:w="2556"/>
@@ -2391,6 +2164,9 @@
         </w:tc>
       </w:tr>
       <w:tr>
+        <w:trPr>
+          <w:cantSplit/>
+        </w:trPr>
         <w:tc>
           <w:tcPr>
             <w:tcW w:type="dxa" w:w="2556"/>
@@ -2433,6 +2209,9 @@
         </w:tc>
       </w:tr>
       <w:tr>
+        <w:trPr>
+          <w:cantSplit/>
+        </w:trPr>
         <w:tc>
           <w:tcPr>
             <w:tcW w:type="dxa" w:w="2556"/>
@@ -2459,7 +2238,7 @@
           </w:tcPr>
           <w:p>
             <w:r>
-              <w:t>0,80 P@5 против 0,475; источник и дата; FSP только внутри категории</w:t>
+              <w:t>matching-1.1.0, полные/частичные совпадения, источник и дата; FSP только внутри категории</w:t>
             </w:r>
           </w:p>
         </w:tc>
@@ -2469,12 +2248,15 @@
           </w:tcPr>
           <w:p>
             <w:r>
-              <w:t>pass на синтетике, рыночная релевантность не доказана</w:t>
+              <w:t>логика проверена; прежний P@5 относится к синтетическому MVP, качество рынка не доказано</w:t>
             </w:r>
           </w:p>
         </w:tc>
       </w:tr>
       <w:tr>
+        <w:trPr>
+          <w:cantSplit/>
+        </w:trPr>
         <w:tc>
           <w:tcPr>
             <w:tcW w:type="dxa" w:w="2556"/>
@@ -2517,6 +2299,9 @@
         </w:tc>
       </w:tr>
       <w:tr>
+        <w:trPr>
+          <w:cantSplit/>
+        </w:trPr>
         <w:tc>
           <w:tcPr>
             <w:tcW w:type="dxa" w:w="2556"/>
@@ -2559,6 +2344,9 @@
         </w:tc>
       </w:tr>
       <w:tr>
+        <w:trPr>
+          <w:cantSplit/>
+        </w:trPr>
         <w:tc>
           <w:tcPr>
             <w:tcW w:type="dxa" w:w="2556"/>
@@ -2601,6 +2389,9 @@
         </w:tc>
       </w:tr>
       <w:tr>
+        <w:trPr>
+          <w:cantSplit/>
+        </w:trPr>
         <w:tc>
           <w:tcPr>
             <w:tcW w:type="dxa" w:w="2556"/>
@@ -2643,6 +2434,9 @@
         </w:tc>
       </w:tr>
       <w:tr>
+        <w:trPr>
+          <w:cantSplit/>
+        </w:trPr>
         <w:tc>
           <w:tcPr>
             <w:tcW w:type="dxa" w:w="2556"/>
@@ -2685,6 +2479,9 @@
         </w:tc>
       </w:tr>
       <w:tr>
+        <w:trPr>
+          <w:cantSplit/>
+        </w:trPr>
         <w:tc>
           <w:tcPr>
             <w:tcW w:type="dxa" w:w="2556"/>
@@ -2727,6 +2524,9 @@
         </w:tc>
       </w:tr>
       <w:tr>
+        <w:trPr>
+          <w:cantSplit/>
+        </w:trPr>
         <w:tc>
           <w:tcPr>
             <w:tcW w:type="dxa" w:w="2556"/>
@@ -2769,6 +2569,9 @@
         </w:tc>
       </w:tr>
       <w:tr>
+        <w:trPr>
+          <w:cantSplit/>
+        </w:trPr>
         <w:tc>
           <w:tcPr>
             <w:tcW w:type="dxa" w:w="2556"/>
@@ -2811,6 +2614,9 @@
         </w:tc>
       </w:tr>
       <w:tr>
+        <w:trPr>
+          <w:cantSplit/>
+        </w:trPr>
         <w:tc>
           <w:tcPr>
             <w:tcW w:type="dxa" w:w="2556"/>
@@ -2847,12 +2653,15 @@
           </w:tcPr>
           <w:p>
             <w:r>
-              <w:t>pass; код отправлен в GitHub, ветка codex/fsp-mvp; локальная история сохранена</w:t>
+              <w:t>pass; код отправлен в GitHub, ветка codex/platform-fixes-20261011; локальная история сохранена</w:t>
             </w:r>
           </w:p>
         </w:tc>
       </w:tr>
       <w:tr>
+        <w:trPr>
+          <w:cantSplit/>
+        </w:trPr>
         <w:tc>
           <w:tcPr>
             <w:tcW w:type="dxa" w:w="2556"/>
@@ -2879,7 +2688,7 @@
           </w:tcPr>
           <w:p>
             <w:r>
-              <w:t>схемы 27 операций / 35 моделей, DOCX/PDF, инструкции</w:t>
+              <w:t>схемы 28 операций / 39 моделей, DOCX/PDF, инструкции</w:t>
             </w:r>
           </w:p>
         </w:tc>
@@ -2889,12 +2698,15 @@
           </w:tcPr>
           <w:p>
             <w:r>
-              <w:t>реализовано; визуальная проверка документов — release-checks</w:t>
+              <w:t>реализовано; актуальная проверка руководства — documentation-checks.json</w:t>
             </w:r>
           </w:p>
         </w:tc>
       </w:tr>
       <w:tr>
+        <w:trPr>
+          <w:cantSplit/>
+        </w:trPr>
         <w:tc>
           <w:tcPr>
             <w:tcW w:type="dxa" w:w="2556"/>
@@ -2937,6 +2749,9 @@
         </w:tc>
       </w:tr>
       <w:tr>
+        <w:trPr>
+          <w:cantSplit/>
+        </w:trPr>
         <w:tc>
           <w:tcPr>
             <w:tcW w:type="dxa" w:w="2556"/>
@@ -2979,6 +2794,9 @@
         </w:tc>
       </w:tr>
       <w:tr>
+        <w:trPr>
+          <w:cantSplit/>
+        </w:trPr>
         <w:tc>
           <w:tcPr>
             <w:tcW w:type="dxa" w:w="2556"/>
@@ -2995,7 +2813,7 @@
           </w:tcPr>
           <w:p>
             <w:r>
-              <w:t>loopback стенд + SSH / видео</w:t>
+              <w:t>публичный HTTPS, loopback + SSH для разработки</w:t>
             </w:r>
           </w:p>
         </w:tc>
@@ -3005,7 +2823,7 @@
           </w:tcPr>
           <w:p>
             <w:r>
-              <w:t>Compose и Chromium</w:t>
+              <w:t>полный Chromium-сценарий на https://85-137-26-131.sslip.io</w:t>
             </w:r>
           </w:p>
         </w:tc>
@@ -3015,12 +2833,15 @@
           </w:tcPr>
           <w:p>
             <w:r>
-              <w:t>pass через разрешённую альтернативу видео + локальный запуск; публичного домена нет</w:t>
+              <w:t>pass; внешний порт 443, HTTP перенаправляется</w:t>
             </w:r>
           </w:p>
         </w:tc>
       </w:tr>
       <w:tr>
+        <w:trPr>
+          <w:cantSplit/>
+        </w:trPr>
         <w:tc>
           <w:tcPr>
             <w:tcW w:type="dxa" w:w="2556"/>
@@ -3063,6 +2884,9 @@
         </w:tc>
       </w:tr>
       <w:tr>
+        <w:trPr>
+          <w:cantSplit/>
+        </w:trPr>
         <w:tc>
           <w:tcPr>
             <w:tcW w:type="dxa" w:w="2556"/>
@@ -3105,6 +2929,9 @@
         </w:tc>
       </w:tr>
       <w:tr>
+        <w:trPr>
+          <w:cantSplit/>
+        </w:trPr>
         <w:tc>
           <w:tcPr>
             <w:tcW w:type="dxa" w:w="2556"/>
@@ -3147,13 +2974,16 @@
         </w:tc>
       </w:tr>
       <w:tr>
+        <w:trPr>
+          <w:cantSplit/>
+        </w:trPr>
         <w:tc>
           <w:tcPr>
             <w:tcW w:type="dxa" w:w="2556"/>
           </w:tcPr>
           <w:p>
             <w:r>
-              <w:t>O02</w:t>
+              <w:t>O02 / E09</w:t>
             </w:r>
           </w:p>
         </w:tc>
@@ -3163,7 +2993,7 @@
           </w:tcPr>
           <w:p>
             <w:r>
-              <w:t>задания работодателя</w:t>
+              <w:t>адресные регулярные задания работодателя</w:t>
             </w:r>
           </w:p>
         </w:tc>
@@ -3173,7 +3003,7 @@
           </w:tcPr>
           <w:p>
             <w:r>
-              <w:t>отсутствуют</w:t>
+              <w:t>сущностей, маршрутов, UI и планировщика нет; план в отчёте от 11 октября</w:t>
             </w:r>
           </w:p>
         </w:tc>
@@ -3183,12 +3013,15 @@
           </w:tcPr>
           <w:p>
             <w:r>
-              <w:t>не реализовано, необязательное</w:t>
+              <w:t>не реализовано; дополнительная функция по ТЗ/VS.5</w:t>
             </w:r>
           </w:p>
         </w:tc>
       </w:tr>
       <w:tr>
+        <w:trPr>
+          <w:cantSplit/>
+        </w:trPr>
         <w:tc>
           <w:tcPr>
             <w:tcW w:type="dxa" w:w="2556"/>
@@ -3231,6 +3064,9 @@
         </w:tc>
       </w:tr>
       <w:tr>
+        <w:trPr>
+          <w:cantSplit/>
+        </w:trPr>
         <w:tc>
           <w:tcPr>
             <w:tcW w:type="dxa" w:w="2556"/>
@@ -3257,7 +3093,7 @@
           </w:tcPr>
           <w:p>
             <w:r>
-              <w:t>Chromium 390/1440 px, no overflow</w:t>
+              <w:t>Chromium; затронутые экраны 360/390/768 px, no overflow</w:t>
             </w:r>
           </w:p>
         </w:tc>
@@ -3273,6 +3109,9 @@
         </w:tc>
       </w:tr>
       <w:tr>
+        <w:trPr>
+          <w:cantSplit/>
+        </w:trPr>
         <w:tc>
           <w:tcPr>
             <w:tcW w:type="dxa" w:w="2556"/>
@@ -3315,6 +3154,9 @@
         </w:tc>
       </w:tr>
       <w:tr>
+        <w:trPr>
+          <w:cantSplit/>
+        </w:trPr>
         <w:tc>
           <w:tcPr>
             <w:tcW w:type="dxa" w:w="2556"/>
@@ -3363,6 +3205,24 @@
       </w:r>
     </w:p>
     <w:p>
+      <w:pPr>
+        <w:pStyle w:val="Heading2"/>
+      </w:pPr>
+      <w:r>
+        <w:t>Уточнение PR.1</w:t>
+      </w:r>
+    </w:p>
+    <w:p>
+      <w:r>
+        <w:t>Материалы test–retest и разделяющей силы есть в evaluation/bank_v2_audit.py и BANK_V2_PROTOCOL.md. Повторная симуляция воспроизводима; сильные/слабые профили заданы её конструкцией. Реальные участники: 0, human pilot not_run. Допустимую по ответу PR.1 симуляцию нельзя называть проверкой на людях.</w:t>
+      </w:r>
+    </w:p>
+    <w:p>
+      <w:r>
+        <w:t>Последние регрессии: 73 серверных теста, 55 проверок склонений и 18 браузерных проверок требований. Состав попытки, история, 24/90 дней и закрытые/открытые PDF проверены отдельно; подробности и границы — VALIDATION.md.</w:t>
+      </w:r>
+    </w:p>
+    <w:p>
       <w:r>
         <w:br w:type="page"/>
       </w:r>
@@ -3396,6 +3256,10 @@
         <w:gridCol w:w="5112"/>
       </w:tblGrid>
       <w:tr>
+        <w:trPr>
+          <w:tblHeader/>
+          <w:cantSplit/>
+        </w:trPr>
         <w:tc>
           <w:tcPr>
             <w:tcW w:type="dxa" w:w="5112"/>
@@ -3418,6 +3282,9 @@
         </w:tc>
       </w:tr>
       <w:tr>
+        <w:trPr>
+          <w:cantSplit/>
+        </w:trPr>
         <w:tc>
           <w:tcPr>
             <w:tcW w:type="dxa" w:w="5112"/>
@@ -3440,6 +3307,9 @@
         </w:tc>
       </w:tr>
       <w:tr>
+        <w:trPr>
+          <w:cantSplit/>
+        </w:trPr>
         <w:tc>
           <w:tcPr>
             <w:tcW w:type="dxa" w:w="5112"/>
@@ -3462,6 +3332,9 @@
         </w:tc>
       </w:tr>
       <w:tr>
+        <w:trPr>
+          <w:cantSplit/>
+        </w:trPr>
         <w:tc>
           <w:tcPr>
             <w:tcW w:type="dxa" w:w="5112"/>
@@ -3484,6 +3357,9 @@
         </w:tc>
       </w:tr>
       <w:tr>
+        <w:trPr>
+          <w:cantSplit/>
+        </w:trPr>
         <w:tc>
           <w:tcPr>
             <w:tcW w:type="dxa" w:w="5112"/>
@@ -3506,6 +3382,9 @@
         </w:tc>
       </w:tr>
       <w:tr>
+        <w:trPr>
+          <w:cantSplit/>
+        </w:trPr>
         <w:tc>
           <w:tcPr>
             <w:tcW w:type="dxa" w:w="5112"/>
@@ -3528,6 +3407,9 @@
         </w:tc>
       </w:tr>
       <w:tr>
+        <w:trPr>
+          <w:cantSplit/>
+        </w:trPr>
         <w:tc>
           <w:tcPr>
             <w:tcW w:type="dxa" w:w="5112"/>
@@ -3550,6 +3432,9 @@
         </w:tc>
       </w:tr>
       <w:tr>
+        <w:trPr>
+          <w:cantSplit/>
+        </w:trPr>
         <w:tc>
           <w:tcPr>
             <w:tcW w:type="dxa" w:w="5112"/>
@@ -3572,6 +3457,9 @@
         </w:tc>
       </w:tr>
       <w:tr>
+        <w:trPr>
+          <w:cantSplit/>
+        </w:trPr>
         <w:tc>
           <w:tcPr>
             <w:tcW w:type="dxa" w:w="5112"/>
@@ -3594,6 +3482,9 @@
         </w:tc>
       </w:tr>
       <w:tr>
+        <w:trPr>
+          <w:cantSplit/>
+        </w:trPr>
         <w:tc>
           <w:tcPr>
             <w:tcW w:type="dxa" w:w="5112"/>
@@ -3616,6 +3507,9 @@
         </w:tc>
       </w:tr>
       <w:tr>
+        <w:trPr>
+          <w:cantSplit/>
+        </w:trPr>
         <w:tc>
           <w:tcPr>
             <w:tcW w:type="dxa" w:w="5112"/>
@@ -3638,6 +3532,9 @@
         </w:tc>
       </w:tr>
       <w:tr>
+        <w:trPr>
+          <w:cantSplit/>
+        </w:trPr>
         <w:tc>
           <w:tcPr>
             <w:tcW w:type="dxa" w:w="5112"/>
@@ -3660,6 +3557,34 @@
         </w:tc>
       </w:tr>
       <w:tr>
+        <w:trPr>
+          <w:cantSplit/>
+        </w:trPr>
+        <w:tc>
+          <w:tcPr>
+            <w:tcW w:type="dxa" w:w="5112"/>
+          </w:tcPr>
+          <w:p>
+            <w:r>
+              <w:t>GET /api/me/assessment-availability</w:t>
+            </w:r>
+          </w:p>
+        </w:tc>
+        <w:tc>
+          <w:tcPr>
+            <w:tcW w:type="dxa" w:w="5112"/>
+          </w:tcPr>
+          <w:p>
+            <w:r>
+              <w:t>кандидат: актуальная конфигурация каждого уровня, available, причины ограничений и ближайшее начало</w:t>
+            </w:r>
+          </w:p>
+        </w:tc>
+      </w:tr>
+      <w:tr>
+        <w:trPr>
+          <w:cantSplit/>
+        </w:trPr>
         <w:tc>
           <w:tcPr>
             <w:tcW w:type="dxa" w:w="5112"/>
@@ -3682,6 +3607,9 @@
         </w:tc>
       </w:tr>
       <w:tr>
+        <w:trPr>
+          <w:cantSplit/>
+        </w:trPr>
         <w:tc>
           <w:tcPr>
             <w:tcW w:type="dxa" w:w="5112"/>
@@ -3704,6 +3632,9 @@
         </w:tc>
       </w:tr>
       <w:tr>
+        <w:trPr>
+          <w:cantSplit/>
+        </w:trPr>
         <w:tc>
           <w:tcPr>
             <w:tcW w:type="dxa" w:w="5112"/>
@@ -3726,6 +3657,9 @@
         </w:tc>
       </w:tr>
       <w:tr>
+        <w:trPr>
+          <w:cantSplit/>
+        </w:trPr>
         <w:tc>
           <w:tcPr>
             <w:tcW w:type="dxa" w:w="5112"/>
@@ -3748,6 +3682,9 @@
         </w:tc>
       </w:tr>
       <w:tr>
+        <w:trPr>
+          <w:cantSplit/>
+        </w:trPr>
         <w:tc>
           <w:tcPr>
             <w:tcW w:type="dxa" w:w="5112"/>
@@ -3770,6 +3707,9 @@
         </w:tc>
       </w:tr>
       <w:tr>
+        <w:trPr>
+          <w:cantSplit/>
+        </w:trPr>
         <w:tc>
           <w:tcPr>
             <w:tcW w:type="dxa" w:w="5112"/>
@@ -3792,6 +3732,9 @@
         </w:tc>
       </w:tr>
       <w:tr>
+        <w:trPr>
+          <w:cantSplit/>
+        </w:trPr>
         <w:tc>
           <w:tcPr>
             <w:tcW w:type="dxa" w:w="5112"/>
@@ -3814,6 +3757,9 @@
         </w:tc>
       </w:tr>
       <w:tr>
+        <w:trPr>
+          <w:cantSplit/>
+        </w:trPr>
         <w:tc>
           <w:tcPr>
             <w:tcW w:type="dxa" w:w="5112"/>
@@ -3836,6 +3782,9 @@
         </w:tc>
       </w:tr>
       <w:tr>
+        <w:trPr>
+          <w:cantSplit/>
+        </w:trPr>
         <w:tc>
           <w:tcPr>
             <w:tcW w:type="dxa" w:w="5112"/>
@@ -3858,6 +3807,9 @@
         </w:tc>
       </w:tr>
       <w:tr>
+        <w:trPr>
+          <w:cantSplit/>
+        </w:trPr>
         <w:tc>
           <w:tcPr>
             <w:tcW w:type="dxa" w:w="5112"/>
@@ -3880,6 +3832,9 @@
         </w:tc>
       </w:tr>
       <w:tr>
+        <w:trPr>
+          <w:cantSplit/>
+        </w:trPr>
         <w:tc>
           <w:tcPr>
             <w:tcW w:type="dxa" w:w="5112"/>
@@ -3902,6 +3857,9 @@
         </w:tc>
       </w:tr>
       <w:tr>
+        <w:trPr>
+          <w:cantSplit/>
+        </w:trPr>
         <w:tc>
           <w:tcPr>
             <w:tcW w:type="dxa" w:w="5112"/>
@@ -3924,6 +3882,11 @@
         </w:tc>
       </w:tr>
     </w:tbl>
+    <w:p>
+      <w:r>
+        <w:t>Количество в attempt.rubric.question_count равно длине сохранённых questions, включая старые попытки. Версия методики и пороги остаются историческими; попытки не пересоздаются. До старта UI использует конфигурацию выбранного уровня из assessment-availability, а не последнюю попытку. Если ограничений несколько, next_available_at — самая поздняя из их дат. При незаполненном профиле дата не обещается (null). Снимок доступности обновляется в UI каждые 30 секунд и при возвращении в окно; POST повторяет проверку под блокировкой профиля. Активный тест при повторном POST возвращается как прежде, без второй попытки. Даты API остаются ISO; UI и PDF показывают МСК (UTC+03:00).</w:t>
+      </w:r>
+    </w:p>
     <w:p>
       <w:r>
         <w:t>Пример структурированной потребности:</w:t>
@@ -4015,7 +3978,32 @@
     </w:p>
     <w:p>
       <w:r>
-        <w:t>1. Получить у ФСП адрес Keycloak issuer, регистрацию OIDC-клиента,    разрешённые redirect URI, API достижений, scopes и тестовые учётные записи. 2. Вход через Authorization Code + PKCE. Проверять state/nonce, issuer,    audience, срок и подпись ID token по доверенному JWKS. Не принимать    переданный браузером ID/статус победителя как доказательство. 3. Привязка внешнего (issuer, subject) к локальному User только из    действующей сессии и после подтверждённого OIDC-перехода. Не объединять    аккаунты автоматически по неподтверждённому email. Уникальность пары — в БД. 4. Сервер запрашивает достижения по минимально необходимому scope;    хранит provider, внешний ID события, результат, дату, время проверки    и источник. Секреты и access/refresh tokens не уходят в браузер и логи. 5. Реализовать отзыв связи, истечение/обновление свидетельства, повторную    синхронизацию и понятное состояние недоступности внешнего API. 6. Дополнить контракт провайдера, схемы верификации, миграцию и тесты:    чужой subject, повторный callback, неверные issuer/audience/nonce,    истёкший токен, подмена достижения, частичная недоступность.</w:t>
+        <w:t>1. Получить у ФСП адрес Keycloak issuer, регистрацию OIDC-клиента,    разрешённые redirect URI, API достижений, scopes и тестовые учётные записи.</w:t>
+      </w:r>
+    </w:p>
+    <w:p>
+      <w:r>
+        <w:t>2. Вход через Authorization Code + PKCE. Проверять state/nonce, issuer,    audience, срок и подпись ID token по доверенному JWKS. Не принимать    переданный браузером ID/статус победителя как доказательство.</w:t>
+      </w:r>
+    </w:p>
+    <w:p>
+      <w:r>
+        <w:t>3. Привязка внешнего (issuer, subject) к локальному User только из    действующей сессии и после подтверждённого OIDC-перехода. Не объединять    аккаунты автоматически по неподтверждённому email. Уникальность пары — в БД.</w:t>
+      </w:r>
+    </w:p>
+    <w:p>
+      <w:r>
+        <w:t>4. Сервер запрашивает достижения по минимально необходимому scope;    хранит provider, внешний ID события, результат, дату, время проверки    и источник. Секреты и access/refresh tokens не уходят в браузер и логи.</w:t>
+      </w:r>
+    </w:p>
+    <w:p>
+      <w:r>
+        <w:t>5. Реализовать отзыв связи, истечение/обновление свидетельства, повторную    синхронизацию и понятное состояние недоступности внешнего API.</w:t>
+      </w:r>
+    </w:p>
+    <w:p>
+      <w:r>
+        <w:t>6. Дополнить контракт провайдера, схемы верификации, миграцию и тесты:    чужой subject, повторный callback, неверные issuer/audience/nonce,    истёкший токен, подмена достижения, частичная недоступность.</w:t>
       </w:r>
     </w:p>
     <w:p>
@@ -4098,7 +4086,7 @@
     </w:p>
     <w:p>
       <w:r>
-        <w:t>Перед публичным использованием оператор должен настроить собственный HTTPS reverse proxy, PUBLIC_URL и COOKIE_SECURE=true. Текущий стенд — loopback HTTP для локального показа. Приложение не заявлено как готовое производственное решение для персональных данных: нужны правила хранения, удаления/запросов субъекта, юридические документы оператора и оценка размещения. Наличие checkbox и журналов согласия не является заявлением о полной юридической сертификации. Реальные CV для разработки не использовались.</w:t>
+        <w:t>Для публичного демостенда настроен отдельный Caddy в профиле https, PUBLIC_URL=https://85-137-26-131.sslip.io и COOKIE_SECURE=true. Вход — через порты 80/443; HTTP перенаправляется на HTTPS. Внутренний порт 3080 и БД остаются на loopback. Сертификат Let's Encrypt автоматически продлевает Caddy; конфигурация и проверки (HTTPS.md). Приложение не заявлено как готовое производственное решение для персональных данных: нужны правила хранения, удаления/запросов субъекта, юридические документы оператора и оценка размещения. Наличие checkbox и журналов согласия не является заявлением о полной юридической сертификации. UI-проверки используют вымышленные профили. Отдельный исследовательский контур V4 использует реальные исторические тексты CV; они не импортированы в публичную БД сервиса и не публикуются в GitHub.</w:t>
       </w:r>
     </w:p>
     <w:p>
@@ -4147,6 +4135,84 @@
     <w:p>
       <w:r>
         <w:t>Материалы исходного архива сохранены. Полное трёхпроходное чтение всех его файлов не завершено. Автоматические хеши/сканы и содержательное чтение разделены в docs/review; разрешение перейти к коду не меняет эти статусы.</w:t>
+      </w:r>
+    </w:p>
+    <w:p>
+      <w:pPr>
+        <w:pStyle w:val="Heading2"/>
+      </w:pPr>
+      <w:r>
+        <w:t>Установка и обновление текущей версии</w:t>
+      </w:r>
+    </w:p>
+    <w:p>
+      <w:r>
+        <w:t>Для новой установки: Docker Engine/Compose v2, Python 3; команды из корня checkout:</w:t>
+      </w:r>
+    </w:p>
+    <w:p>
+      <w:pPr>
+        <w:pStyle w:val="NoSpacing"/>
+      </w:pPr>
+      <w:r>
+        <w:rPr>
+          <w:rFonts w:ascii="DejaVu Sans Mono" w:hAnsi="DejaVu Sans Mono"/>
+          <w:sz w:val="16"/>
+        </w:rPr>
+        <w:t>git clone --branch codex/platform-fixes-20261011 https://github.com/ImmortalDR/CV_hakaton.git</w:t>
+        <w:br/>
+        <w:t>cd CV_hakaton</w:t>
+        <w:br/>
+        <w:t>python3 scripts/configure.py</w:t>
+        <w:br/>
+        <w:t>docker compose up -d --build --wait</w:t>
+        <w:br/>
+        <w:t>curl --fail http://127.0.0.1:3080/api/health</w:t>
+      </w:r>
+    </w:p>
+    <w:p>
+      <w:r>
+        <w:t>configure.py создаёт только отсутствующий .env с правами 0600. Существующий пароль БД менять при обычном обновлении нельзя. По умолчанию веб-порт 3080 и PostgreSQL 5547 доступны только через loopback. Для удалённого просмотра: ssh -L 3080:127.0.0.1:3080 USER@SERVER, затем http://localhost:3080.</w:t>
+      </w:r>
+    </w:p>
+    <w:p>
+      <w:r>
+        <w:t>На действующем сервере код исправлений развёрнут из отдельного worktree /root/hakaton-fixes-20261011. Исходный /root/hakaton содержит незакоммиченные материалы команды: их нельзя заменять checkout/reset. Перед обновлением проверьте git status, выбранную ветку и существующий Compose-проект fsp-mvp. После получения совместимой версии, сохранения дампа и проверки миграций:</w:t>
+      </w:r>
+    </w:p>
+    <w:p>
+      <w:pPr>
+        <w:pStyle w:val="NoSpacing"/>
+      </w:pPr>
+      <w:r>
+        <w:rPr>
+          <w:rFonts w:ascii="DejaVu Sans Mono" w:hAnsi="DejaVu Sans Mono"/>
+          <w:sz w:val="16"/>
+        </w:rPr>
+        <w:t>docker compose build api web</w:t>
+        <w:br/>
+        <w:t>docker compose up -d --no-deps --wait api web</w:t>
+        <w:br/>
+        <w:t>curl --fail https://85-137-26-131.sslip.io/api/health</w:t>
+        <w:br/>
+        <w:t>docker compose ps</w:t>
+        <w:br/>
+        <w:t>docker compose logs --tail=80 api web</w:t>
+      </w:r>
+    </w:p>
+    <w:p>
+      <w:r>
+        <w:t>Для изменений 11 октября миграции не нужны. У других обновлений совместимость схемы нужно проверять отдельно. Откат образов безопасен только при совместимой БД; сначала проверьте восстановление дампа в отдельной тестовой базе.</w:t>
+      </w:r>
+    </w:p>
+    <w:p>
+      <w:r>
+        <w:t>Перед исправлениями сохранён дамп local-backups/platform-fixes-20261011/ fsp-before.dump в исходном рабочем каталоге, читаемость проверена pg_restore. Предыдущие образы сохранены под тегами before-platform-fixes-20261011 для fsp-mvp-api и fsp-mvp-web. Эти локальные артефакты не входят в GitHub.</w:t>
+      </w:r>
+    </w:p>
+    <w:p>
+      <w:r>
+        <w:t>Для HTTPS используйте существующий профиль https и настройки из HTTPS.md: PUBLIC_URL, COOKIE_SECURE=true, HTTPS_HOST, HTTPS_SITE_ADDRESSES и ACME_DIRECTORY. Секреты не копируйте в логи. Здоровье Caddy, срок сертификата и внешний HTTP-запрос проверяются отдельно: успешный API health не доказывает исправность каждой пробы. Обновление документации само по себе не требует перезапуска приложения.</w:t>
       </w:r>
     </w:p>
     <w:sectPr>

</xml_diff>

<commit_message>
Implement consent-based recurring tasks and reproducible non-mail acceptance with validation protocols
</commit_message>
<xml_diff>
--- a/docs/delivery/FSP_MVP.docx
+++ b/docs/delivery/FSP_MVP.docx
@@ -19,14 +19,14 @@
       <w:r>
         <w:t>Обратный найм по подтверждённым навыкам</w:t>
         <w:br/>
-        <w:t>Редакция 11 октября 2026 · приложение 785d362</w:t>
+        <w:t>Редакция 11 октября 2026 · релиз 2026-10-11-modernization</w:t>
       </w:r>
     </w:p>
     <w:p>
       <w:r>
         <w:t>Код: github.com/ImmortalDR/CV_hakaton</w:t>
         <w:br/>
-        <w:t>Рабочая ветка: codex/platform-fixes-20261011</w:t>
+        <w:t>Рабочая ветка: codex/modernization-20261011</w:t>
       </w:r>
     </w:p>
     <w:p>
@@ -94,17 +94,23 @@
     </w:p>
     <w:p>
       <w:r>
-        <w:t>Версии: API 1.0.0 · банк 2.0.0 · подбор matching-1.1.0. Источники разделов и ссылки: docs/delivery/README.md в репозитории.</w:t>
+        <w:t>10. Адресные регулярные задания E09</w:t>
       </w:r>
     </w:p>
     <w:p>
       <w:r>
-        <w:br w:type="page"/>
+        <w:t>11. Протоколы независимой проверки качества</w:t>
+      </w:r>
+    </w:p>
+    <w:p>
+      <w:r>
+        <w:t>Версии: API 1.0.0 · банк 2.0.0 · подбор matching-1.1.0. Источники разделов и ссылки: docs/delivery/README.md в репозитории.</w:t>
       </w:r>
     </w:p>
     <w:p>
       <w:pPr>
         <w:pStyle w:val="Heading1"/>
+        <w:pageBreakBefore/>
       </w:pPr>
       <w:r>
         <w:t>Руководство кандидата и работодателя</w:t>
@@ -435,13 +441,27 @@
       </w:r>
     </w:p>
     <w:p>
+      <w:pPr>
+        <w:pStyle w:val="Heading2"/>
+      </w:pPr>
       <w:r>
-        <w:br w:type="page"/>
+        <w:t>Задания от компаний</w:t>
+      </w:r>
+    </w:p>
+    <w:p>
+      <w:r>
+        <w:t>После принятого приглашения откройте вкладку «Задания от компаний». Работодатель выбирает кандидата, вводит задание, критерии, период и срок ответа. Кандидат сначала читает условия и отдельно включает выдачу. Первое задание появляется сразу; ответ отправляется один раз до срока. Работодатель сохраняет оценку и комментарий. Эта оценка не заменяет профессиональный тест.</w:t>
+      </w:r>
+    </w:p>
+    <w:p>
+      <w:r>
+        <w:t>Кандидат может приостановить или закрыть план; работодатель — закрыть его. Счётчик вкладки показывает ожидающие действия. При снятии публикации планы приостанавливаются, открытые задания отменяются, работодатель теряет доступ к ответам. Повторная публикация сама не восстанавливает согласия. Подробные состояния и ограничения — TASKS.md.</w:t>
       </w:r>
     </w:p>
     <w:p>
       <w:pPr>
         <w:pStyle w:val="Heading1"/>
+        <w:pageBreakBefore/>
       </w:pPr>
       <w:r>
         <w:t>Архитектура MVP · редакция 11 октября 2026</w:t>
@@ -449,7 +469,7 @@
     </w:p>
     <w:p>
       <w:r>
-        <w:t>Состояние приложения: 785d362, банк 2.0.0, подбор matching-1.1.0.</w:t>
+        <w:t>Состояние приложения: 2026-10-11-modernization, банк 2.0.0, подбор matching-1.1.0.</w:t>
       </w:r>
     </w:p>
     <w:p>
@@ -473,7 +493,7 @@
     </w:p>
     <w:p>
       <w:r>
-        <w:t>apps/api/fsp/models.py содержит 14 таблиц. Пользователь отделён от компании через CompanyMember. В MVP один пользователь принадлежит одной компании; управление сотрудниками через UI отложено. Категории, грейды, навыки и семейства задач — версионные справочники bank.py, без отдельного CRUD администратора.</w:t>
+        <w:t>apps/api/fsp/models.py содержит 16 таблиц. Пользователь отделён от компании через CompanyMember. В MVP один пользователь принадлежит одной компании; управление сотрудниками через UI отложено. Категории, грейды, навыки и семейства задач — версионные справочники bank.py, без отдельного CRUD администратора.</w:t>
       </w:r>
     </w:p>
     <w:p>
@@ -576,13 +596,27 @@
       </w:r>
     </w:p>
     <w:p>
+      <w:pPr>
+        <w:pStyle w:val="Heading2"/>
+      </w:pPr>
       <w:r>
-        <w:br w:type="page"/>
+        <w:t>Регулярные задания</w:t>
+      </w:r>
+    </w:p>
+    <w:p>
+      <w:r>
+        <w:t>TaskPlan хранит неизменяемые условия, согласие и расписание; TaskAssignment — снимок версии, ответ, срок и ручную оценку. Отдельный worker раз в 60 секунд проверяет активные планы. API и worker блокируют Profile, затем TaskPlan; повторная выдача защищена уникальным номером внутри плана. После простоя не выдаётся пачка пропущенных задач. Отзыв публикации приостанавливает планы, отменяет открытые задания и закрывает ответы от работодателя. Смена грейда и формула matching не затрагиваются. Подробности — TASKS.md.</w:t>
+      </w:r>
+    </w:p>
+    <w:p>
+      <w:r>
+        <w:t>Nginx обновляет адрес API через Docker DNS (upstream resolve); проверка здоровья web обращается к /api/health, поэтому проверяет и проксирование.</w:t>
       </w:r>
     </w:p>
     <w:p>
       <w:pPr>
         <w:pStyle w:val="Heading1"/>
+        <w:pageBreakBefore/>
       </w:pPr>
       <w:r>
         <w:t>Банк и рубрика 2.0.0</w:t>
@@ -918,13 +952,9 @@
       </w:r>
     </w:p>
     <w:p>
-      <w:r>
-        <w:br w:type="page"/>
-      </w:r>
-    </w:p>
-    <w:p>
       <w:pPr>
         <w:pStyle w:val="Heading1"/>
+        <w:pageBreakBefore/>
       </w:pPr>
       <w:r>
         <w:t>Данные, модели и пределы доказательств</w:t>
@@ -1140,13 +1170,9 @@
       </w:r>
     </w:p>
     <w:p>
-      <w:r>
-        <w:br w:type="page"/>
-      </w:r>
-    </w:p>
-    <w:p>
       <w:pPr>
         <w:pStyle w:val="Heading1"/>
+        <w:pageBreakBefore/>
       </w:pPr>
       <w:r>
         <w:t>Фактические результаты проверки · 11 октября 2026</w:t>
@@ -1154,7 +1180,7 @@
     </w:p>
     <w:p>
       <w:r>
-        <w:t>Последняя проверенная версия приложения — 785d362, банк 2.0.0, matching-1.1.0. Документ объединяет результаты разных дат с указанием границ. Обновление документации не означает повторного запуска всех перечисленных экспериментов. Первоначальный отчёт сохранён в VALIDATION_2026-10-07.md; его показатели относятся к старым версиям и не являются текущими метриками.</w:t>
+        <w:t>Текущий релиз — 2026-10-11-modernization, банк 2.0.0, matching-1.1.0. Документ объединяет результаты разных дат с указанием границ. Обновление документации не означает повторного запуска всех перечисленных экспериментов. Первоначальный отчёт сохранён в VALIDATION_2026-10-07.md; его показатели относятся к старым версиям и не являются текущими метриками.</w:t>
       </w:r>
     </w:p>
     <w:p>
@@ -1232,7 +1258,7 @@
           </w:tcPr>
           <w:p>
             <w:r>
-              <w:t>COOKIE_SECURE=false python3 scripts/run_local.py .venv/bin/pytest -q tests</w:t>
+              <w:t>SMTP_HOST= COOKIE_SECURE=false python3 scripts/run_local.py .venv/bin/pytest -q tests</w:t>
             </w:r>
           </w:p>
         </w:tc>
@@ -1242,7 +1268,7 @@
           </w:tcPr>
           <w:p>
             <w:r>
-              <w:t>73 passed, 18,36 с, 2 предупреждения устаревших зависимостей</w:t>
+              <w:t>84 passed, 29,06 с, 2 предупреждения устаревших зависимостей</w:t>
             </w:r>
           </w:p>
         </w:tc>
@@ -1494,17 +1520,41 @@
     </w:p>
     <w:p>
       <w:r>
-        <w:t>Реальный SMTP, ФСП/Keycloak, человеческий пилот, экспертная разметка, прокторинг, производственная аттестация и полное чтение стороннего архива не подтверждены. Публичный HTTPS работает и проверен; прежняя фраза об отсутствии домена более не актуальна. E09 — отдельные регулярные задания работодателя — не реализован; план включён в текущий отчёт и матрицу.</w:t>
+        <w:t>Реальный SMTP, ФСП/Keycloak, человеческий пилот, экспертная разметка, прокторинг, производственная аттестация и полное чтение стороннего архива не подтверждены. Публичный HTTPS работает и проверен; прежняя фраза об отсутствии домена более не актуальна. E09 реализован в адресном варианте: TASKS.md. Новый результат приёмки и чистого восстановления приведён ниже.</w:t>
+      </w:r>
+    </w:p>
+    <w:p>
+      <w:pPr>
+        <w:pStyle w:val="Heading2"/>
+      </w:pPr>
+      <w:r>
+        <w:t>Модернизация: повторная приёмка</w:t>
       </w:r>
     </w:p>
     <w:p>
       <w:r>
-        <w:br w:type="page"/>
+        <w:t>Единая команда scripts/acceptance.py на отдельном стенде: pass. Она повторила 84 серверных теста, 55 проверок склонений, 18 браузерных сценариев требований, цикл адресного задания и точное сравнение OpenAPI (33 операции / 46 моделей). Браузерные проверки включают тест → результат → доказательства → подбор → приглашение → принятие → контакты → диалог, закрытый/открытый PDF и две компании. Исторические попытки дополнительно покрыты серверной регрессией; отдельный старый UI-прогон описан выше с его фактической датой.</w:t>
+      </w:r>
+    </w:p>
+    <w:p>
+      <w:r>
+        <w:t>Чистая установка scripts/verify_release.py: 16 таблиц, 15 seed-пользователей, нет schema drift; повтор seed сохраняет все строки. Восстановление pg_dump в новую БД совпало по хешам всех таблиц, перезапуск сохранил данные, HTTP health успешен. Первая проверка обнаружила 502 после смены IP API; Nginx исправлен на динамическое разрешение Docker DNS. Повторный полный прогон прошёл. Серийная браузерная проверка первоначально упёрлась в действующий 429; клиент проверки ожидает разрешённый повтор, ограничитель не отключался.</w:t>
+      </w:r>
+    </w:p>
+    <w:p>
+      <w:r>
+        <w:t>Артефакты и скриншоты: docs/review/modernization-2026-10-11/. Отчёты явно отделяют инженерный pass от not_run почты, реального пилота и независимой разметки. Новый пустой human-pilot/analysis.json подтверждает 0 участников, а не положительную валидность. Протоколы — VALIDATION_STUDIES.md.</w:t>
+      </w:r>
+    </w:p>
+    <w:p>
+      <w:r>
+        <w:t>Во время работы коллеги отдельно включили SMTP и изменили регистрацию. Их совместимый блок сохранён в main.py; конфигурация почты не менялась. Полная браузерная приёмка модернизации выполняется на отдельном стенде с SMTP_HOST пустым. На публичном сайте после обновления проверяются HTTPS, API, вход и новые экраны без регистрации вымышленных адресов и отправки писем. Старый полный HTTPS-прогон выше относится к деморежиму до включения SMTP.</w:t>
       </w:r>
     </w:p>
     <w:p>
       <w:pPr>
         <w:pStyle w:val="Heading1"/>
+        <w:pageBreakBefore/>
       </w:pPr>
       <w:r>
         <w:t>Итоговая матрица соответствия · 11 октября 2026</w:t>
@@ -1512,7 +1562,7 @@
     </w:p>
     <w:p>
       <w:r>
-        <w:t>Приложение 785d362; банк 2.0.0; подбор matching-1.1.0.</w:t>
+        <w:t>Релиз 2026-10-11-modernization; банк 2.0.0; подбор matching-1.1.0.</w:t>
       </w:r>
     </w:p>
     <w:p>
@@ -2653,7 +2703,7 @@
           </w:tcPr>
           <w:p>
             <w:r>
-              <w:t>pass; код отправлен в GitHub, ветка codex/platform-fixes-20261011; локальная история сохранена</w:t>
+              <w:t>pass; код отправлен в GitHub, ветка codex/modernization-20261011; локальная история сохранена</w:t>
             </w:r>
           </w:p>
         </w:tc>
@@ -2688,7 +2738,7 @@
           </w:tcPr>
           <w:p>
             <w:r>
-              <w:t>схемы 28 операций / 39 моделей, DOCX/PDF, инструкции</w:t>
+              <w:t>схемы 33 операций / 46 моделей, DOCX/PDF, инструкции</w:t>
             </w:r>
           </w:p>
         </w:tc>
@@ -3003,7 +3053,7 @@
           </w:tcPr>
           <w:p>
             <w:r>
-              <w:t>сущностей, маршрутов, UI и планировщика нет; план в отчёте от 11 октября</w:t>
+              <w:t>TaskPlan/TaskAssignment, API, вкладка, worker, отдельное согласие; проверки прав, сроков, конкуренции и UI</w:t>
             </w:r>
           </w:p>
         </w:tc>
@@ -3013,7 +3063,7 @@
           </w:tcPr>
           <w:p>
             <w:r>
-              <w:t>не реализовано; дополнительная функция по ТЗ/VS.5</w:t>
+              <w:t>реализован адресный вариант; ручная оценка не меняет грейд</w:t>
             </w:r>
           </w:p>
         </w:tc>
@@ -3219,17 +3269,13 @@
     </w:p>
     <w:p>
       <w:r>
-        <w:t>Последние регрессии: 73 серверных теста, 55 проверок склонений и 18 браузерных проверок требований. Состав попытки, история, 24/90 дней и закрытые/открытые PDF проверены отдельно; подробности и границы — VALIDATION.md.</w:t>
-      </w:r>
-    </w:p>
-    <w:p>
-      <w:r>
-        <w:br w:type="page"/>
+        <w:t>Последние регрессии: 84 серверных теста, 55 проверок склонений и 18 браузерных проверок требований. Состав попытки, история, 24/90 дней и закрытые/открытые PDF проверены отдельно; подробности и границы — VALIDATION.md.</w:t>
       </w:r>
     </w:p>
     <w:p>
       <w:pPr>
         <w:pStyle w:val="Heading1"/>
+        <w:pageBreakBefore/>
       </w:pPr>
       <w:r>
         <w:t>API 1.0.0</w:t>
@@ -3949,13 +3995,184 @@
       </w:r>
     </w:p>
     <w:p>
+      <w:pPr>
+        <w:pStyle w:val="Heading2"/>
+      </w:pPr>
       <w:r>
-        <w:br w:type="page"/>
+        <w:t>Задания работодателей</w:t>
+      </w:r>
+    </w:p>
+    <w:tbl>
+      <w:tblPr>
+        <w:tblStyle w:val="LightShading-Accent1"/>
+        <w:tblW w:type="auto" w:w="0"/>
+        <w:tblLook w:firstColumn="1" w:firstRow="1" w:lastColumn="0" w:lastRow="0" w:noHBand="0" w:noVBand="1" w:val="04A0"/>
+      </w:tblPr>
+      <w:tblGrid>
+        <w:gridCol w:w="5112"/>
+        <w:gridCol w:w="5112"/>
+      </w:tblGrid>
+      <w:tr>
+        <w:trPr>
+          <w:tblHeader/>
+          <w:cantSplit/>
+        </w:trPr>
+        <w:tc>
+          <w:tcPr>
+            <w:tcW w:type="dxa" w:w="5112"/>
+          </w:tcPr>
+          <w:p>
+            <w:r>
+              <w:t>Маршрут</w:t>
+            </w:r>
+          </w:p>
+        </w:tc>
+        <w:tc>
+          <w:tcPr>
+            <w:tcW w:type="dxa" w:w="5112"/>
+          </w:tcPr>
+          <w:p>
+            <w:r>
+              <w:t>Доступ и результат</w:t>
+            </w:r>
+          </w:p>
+        </w:tc>
+      </w:tr>
+      <w:tr>
+        <w:trPr>
+          <w:cantSplit/>
+        </w:trPr>
+        <w:tc>
+          <w:tcPr>
+            <w:tcW w:type="dxa" w:w="5112"/>
+          </w:tcPr>
+          <w:p>
+            <w:r>
+              <w:t>GET /api/tasks</w:t>
+            </w:r>
+          </w:p>
+        </w:tc>
+        <w:tc>
+          <w:tcPr>
+            <w:tcW w:type="dxa" w:w="5112"/>
+          </w:tcPr>
+          <w:p>
+            <w:r>
+              <w:t>обе роли: свои планы, задания, счётчик внимания</w:t>
+            </w:r>
+          </w:p>
+        </w:tc>
+      </w:tr>
+      <w:tr>
+        <w:trPr>
+          <w:cantSplit/>
+        </w:trPr>
+        <w:tc>
+          <w:tcPr>
+            <w:tcW w:type="dxa" w:w="5112"/>
+          </w:tcPr>
+          <w:p>
+            <w:r>
+              <w:t>POST /api/tasks/plans</w:t>
+            </w:r>
+          </w:p>
+        </w:tc>
+        <w:tc>
+          <w:tcPr>
+            <w:tcW w:type="dxa" w:w="5112"/>
+          </w:tcPr>
+          <w:p>
+            <w:r>
+              <w:t>работодатель: candidate_id, request_id, title, prompt, rubric, interval_days, response_days; 201</w:t>
+            </w:r>
+          </w:p>
+        </w:tc>
+      </w:tr>
+      <w:tr>
+        <w:trPr>
+          <w:cantSplit/>
+        </w:trPr>
+        <w:tc>
+          <w:tcPr>
+            <w:tcW w:type="dxa" w:w="5112"/>
+          </w:tcPr>
+          <w:p>
+            <w:r>
+              <w:t>PATCH /api/tasks/plans/{pid}</w:t>
+            </w:r>
+          </w:p>
+        </w:tc>
+        <w:tc>
+          <w:tcPr>
+            <w:tcW w:type="dxa" w:w="5112"/>
+          </w:tcPr>
+          <w:p>
+            <w:r>
+              <w:t>кандидат: active/paused/closed; работодатель: только closed</w:t>
+            </w:r>
+          </w:p>
+        </w:tc>
+      </w:tr>
+      <w:tr>
+        <w:trPr>
+          <w:cantSplit/>
+        </w:trPr>
+        <w:tc>
+          <w:tcPr>
+            <w:tcW w:type="dxa" w:w="5112"/>
+          </w:tcPr>
+          <w:p>
+            <w:r>
+              <w:t>POST /api/tasks/assignments/{aid}/answer</w:t>
+            </w:r>
+          </w:p>
+        </w:tc>
+        <w:tc>
+          <w:tcPr>
+            <w:tcW w:type="dxa" w:w="5112"/>
+          </w:tcPr>
+          <w:p>
+            <w:r>
+              <w:t>кандидат: answer, до срока, при активном плане</w:t>
+            </w:r>
+          </w:p>
+        </w:tc>
+      </w:tr>
+      <w:tr>
+        <w:trPr>
+          <w:cantSplit/>
+        </w:trPr>
+        <w:tc>
+          <w:tcPr>
+            <w:tcW w:type="dxa" w:w="5112"/>
+          </w:tcPr>
+          <w:p>
+            <w:r>
+              <w:t>POST /api/tasks/assignments/{aid}/review</w:t>
+            </w:r>
+          </w:p>
+        </w:tc>
+        <w:tc>
+          <w:tcPr>
+            <w:tcW w:type="dxa" w:w="5112"/>
+          </w:tcPr>
+          <w:p>
+            <w:r>
+              <w:t>работодатель: score 0…100, feedback; только после ответа</w:t>
+            </w:r>
+          </w:p>
+        </w:tc>
+      </w:tr>
+    </w:tbl>
+    <w:p>
+      <w:r>
+        <w:t>Действующее адресное согласие и публикация проверяются сервером при каждой операции. Повтор одинакового ответа/оценки возвращает сохранённое, изменение после отправки — 409. Для создания плана request_id повторяют только с теми же условиями. version относится к заданию, а не к банку профессиональных тестов. Поле профиля task_last_reviewed_at сообщает дату ручной проверки задания своей компанией; не присваивает навык или грейд.</w:t>
       </w:r>
     </w:p>
     <w:p>
       <w:pPr>
         <w:pStyle w:val="Heading1"/>
+        <w:pageBreakBefore/>
       </w:pPr>
       <w:r>
         <w:t>ФСП ID и будущий Keycloak</w:t>
@@ -4012,13 +4229,9 @@
       </w:r>
     </w:p>
     <w:p>
-      <w:r>
-        <w:br w:type="page"/>
-      </w:r>
-    </w:p>
-    <w:p>
       <w:pPr>
         <w:pStyle w:val="Heading1"/>
+        <w:pageBreakBefore/>
       </w:pPr>
       <w:r>
         <w:t>Запуск и сопровождение</w:t>
@@ -4159,7 +4372,7 @@
           <w:rFonts w:ascii="DejaVu Sans Mono" w:hAnsi="DejaVu Sans Mono"/>
           <w:sz w:val="16"/>
         </w:rPr>
-        <w:t>git clone --branch codex/platform-fixes-20261011 https://github.com/ImmortalDR/CV_hakaton.git</w:t>
+        <w:t>git clone --branch codex/modernization-20261011 https://github.com/ImmortalDR/CV_hakaton.git</w:t>
         <w:br/>
         <w:t>cd CV_hakaton</w:t>
         <w:br/>
@@ -4189,9 +4402,9 @@
           <w:rFonts w:ascii="DejaVu Sans Mono" w:hAnsi="DejaVu Sans Mono"/>
           <w:sz w:val="16"/>
         </w:rPr>
-        <w:t>docker compose build api web</w:t>
+        <w:t>docker compose build api web task-worker</w:t>
         <w:br/>
-        <w:t>docker compose up -d --no-deps --wait api web</w:t>
+        <w:t>docker compose up -d --no-deps --wait api web task-worker</w:t>
         <w:br/>
         <w:t>curl --fail https://85-137-26-131.sslip.io/api/health</w:t>
         <w:br/>
@@ -4202,7 +4415,7 @@
     </w:p>
     <w:p>
       <w:r>
-        <w:t>Для изменений 11 октября миграции не нужны. У других обновлений совместимость схемы нужно проверять отдельно. Откат образов безопасен только при совместимой БД; сначала проверьте восстановление дампа в отдельной тестовой базе.</w:t>
+        <w:t>Модернизация добавляет миграцию b9e1c4d7a201 с двумя таблицами заданий. Существующие попытки и данные не переписываются. У других обновлений совместимость схемы нужно проверять отдельно. Откат образов безопасен только при совместимой БД; сначала проверьте восстановление дампа в отдельной тестовой базе.</w:t>
       </w:r>
     </w:p>
     <w:p>
@@ -4213,6 +4426,444 @@
     <w:p>
       <w:r>
         <w:t>Для HTTPS используйте существующий профиль https и настройки из HTTPS.md: PUBLIC_URL, COOKIE_SECURE=true, HTTPS_HOST, HTTPS_SITE_ADDRESSES и ACME_DIRECTORY. Секреты не копируйте в логи. Здоровье Caddy, срок сертификата и внешний HTTP-запрос проверяются отдельно: успешный API health не доказывает исправность каждой пробы. Обновление документации само по себе не требует перезапуска приложения.</w:t>
+      </w:r>
+    </w:p>
+    <w:p>
+      <w:pPr>
+        <w:pStyle w:val="Heading2"/>
+      </w:pPr>
+      <w:r>
+        <w:t>Воспроизводимая приёмка и восстановление</w:t>
+      </w:r>
+    </w:p>
+    <w:p>
+      <w:pPr>
+        <w:pStyle w:val="NoSpacing"/>
+      </w:pPr>
+      <w:r>
+        <w:rPr>
+          <w:rFonts w:ascii="DejaVu Sans Mono" w:hAnsi="DejaVu Sans Mono"/>
+          <w:sz w:val="16"/>
+        </w:rPr>
+        <w:t>.venv/bin/python scripts/acceptance.py --base-url http://127.0.0.1:3080 --out audit/acceptance</w:t>
+        <w:br/>
+        <w:t>.venv/bin/python scripts/verify_release.py --project fsp-verify-new --port 3084 --out audit/clean-new</w:t>
+      </w:r>
+    </w:p>
+    <w:p>
+      <w:r>
+        <w:t>Приёмка требует dev-зависимости, Chromium и отдельную fsp_test для backend. Браузерные сценарии работают только на демостенде и создают вымышленные аккаунты, затем снимают публикацию своего кандидата. --skip-backend позволяет отдельно проверить удалённый стенд; отчёт явно укажет пропуск backend.</w:t>
+      </w:r>
+    </w:p>
+    <w:p>
+      <w:r>
+        <w:t>verify_release допускает только новый проект с префиксом fsp-verify-, создаёт независимый пароль и том. Выполняет сборку, миграции, проверку схемы, повтор seed, pg_dump/restore в отдельную БД, сравнение хешей всех 16 таблиц, перезапуск API/web/worker и HTTP-проверку. Секретный compose, env и дамп остаются в audit с правами 0600; публикуется только result.json. Команда оставляет стенд и том для расследования. Остановите именно его:</w:t>
+      </w:r>
+    </w:p>
+    <w:p>
+      <w:pPr>
+        <w:pStyle w:val="NoSpacing"/>
+      </w:pPr>
+      <w:r>
+        <w:rPr>
+          <w:rFonts w:ascii="DejaVu Sans Mono" w:hAnsi="DejaVu Sans Mono"/>
+          <w:sz w:val="16"/>
+        </w:rPr>
+        <w:t>docker compose -p fsp-verify-new -f audit/clean-new/compose.json stop</w:t>
+      </w:r>
+    </w:p>
+    <w:p>
+      <w:r>
+        <w:t>Worker выдаёт задания с точностью до периода опроса (60 секунд), если БД доступна. При сбое он пишет тип ошибки и повторяет цикл; проверяйте logs task-worker. Сам статус Running не доказывает своевременную выдачу. При обновлении с предыдущей версии сохраните дамп и образы; не запускайте downgrade таблиц заданий после начала их использования.</w:t>
+      </w:r>
+    </w:p>
+    <w:p>
+      <w:r>
+        <w:t>Коллеги независимо подключили SMTP во время модернизации. Сохранено правило: если SMTP_HOST задан, регистрация использует настоящую доставку даже при DEMO_MODE=true; демоссылка в этом случае не возвращается. Без SMTP_HOST демоссылка доступна только в деморежиме, иначе 503. Модернизация не проверяла внешнюю доставку и не меняла почтовые секреты. Поэтому acceptance запускать на отдельном демостенде с пустым SMTP_HOST, а не на публичном сайте с почтой.</w:t>
+      </w:r>
+    </w:p>
+    <w:p>
+      <w:r>
+        <w:t>Проверка публичного сайта без регистрации и отправки писем:</w:t>
+      </w:r>
+    </w:p>
+    <w:p>
+      <w:pPr>
+        <w:pStyle w:val="NoSpacing"/>
+      </w:pPr>
+      <w:r>
+        <w:rPr>
+          <w:rFonts w:ascii="DejaVu Sans Mono" w:hAnsi="DejaVu Sans Mono"/>
+          <w:sz w:val="16"/>
+        </w:rPr>
+        <w:t>.venv/bin/python scripts/acceptance.py --read-only --skip-backend --base-url https://85-137-26-131.sslip.io --out audit/public-smoke</w:t>
+      </w:r>
+    </w:p>
+    <w:p>
+      <w:r>
+        <w:t>Нужны доступные общие демовходы; режим не меняет профиль/задания. Caddy теперь запускается с init и GET-пробой /api/health. После наблюдавшегося накопления процессов проверяйте docker stats и healthcheck; долгосрочная стабильность требует наблюдения, краткий успешный прогон её не доказывает.</w:t>
+      </w:r>
+    </w:p>
+    <w:p>
+      <w:pPr>
+        <w:pStyle w:val="Heading1"/>
+        <w:pageBreakBefore/>
+      </w:pPr>
+      <w:r>
+        <w:t>Адресные регулярные задания E09</w:t>
+      </w:r>
+    </w:p>
+    <w:p>
+      <w:r>
+        <w:t>Релиз 2026-10-11-modernization реализует адресный вариант дополнительного пункта E09/VS.5. Это задания конкретной компании конкретному кандидату, а не массовые соревнования категории и не автоматическая пересдача грейда.</w:t>
+      </w:r>
+    </w:p>
+    <w:p>
+      <w:pPr>
+        <w:pStyle w:val="Heading2"/>
+      </w:pPr>
+      <w:r>
+        <w:t>Выдача и доступ</w:t>
+      </w:r>
+    </w:p>
+    <w:p>
+      <w:r>
+        <w:t>Точка входа — вкладка «Задания от компаний» в обоих кабинетах. Работодатель может предложить план только опубликованному кандидату, принявшему его приглашение: требуется действующий ContactGrant. Одного появления в подборе недостаточно. Кандидат отдельно включает выдачу после просмотра условий.</w:t>
+      </w:r>
+    </w:p>
+    <w:p>
+      <w:r>
+        <w:t>Работодатель задаёт название, текст, критерии ручной оценки, период 1…365 дней и срок ответа не длиннее периода. Эти границы — решение MVP, не цитата организаторов. У компании может быть один незакрытый план на кандидата. Шаблон неизменяемый; для других условий нужен новый план и новое согласие. Каждая выдача сохраняет копию текста, критериев и версии.</w:t>
+      </w:r>
+    </w:p>
+    <w:tbl>
+      <w:tblPr>
+        <w:tblStyle w:val="LightShading-Accent1"/>
+        <w:tblW w:type="auto" w:w="0"/>
+        <w:tblLook w:firstColumn="1" w:firstRow="1" w:lastColumn="0" w:lastRow="0" w:noHBand="0" w:noVBand="1" w:val="04A0"/>
+      </w:tblPr>
+      <w:tblGrid>
+        <w:gridCol w:w="5112"/>
+        <w:gridCol w:w="5112"/>
+      </w:tblGrid>
+      <w:tr>
+        <w:trPr>
+          <w:tblHeader/>
+          <w:cantSplit/>
+        </w:trPr>
+        <w:tc>
+          <w:tcPr>
+            <w:tcW w:type="dxa" w:w="5112"/>
+          </w:tcPr>
+          <w:p>
+            <w:r>
+              <w:t>План</w:t>
+            </w:r>
+          </w:p>
+        </w:tc>
+        <w:tc>
+          <w:tcPr>
+            <w:tcW w:type="dxa" w:w="5112"/>
+          </w:tcPr>
+          <w:p>
+            <w:r>
+              <w:t>Значение</w:t>
+            </w:r>
+          </w:p>
+        </w:tc>
+      </w:tr>
+      <w:tr>
+        <w:trPr>
+          <w:cantSplit/>
+        </w:trPr>
+        <w:tc>
+          <w:tcPr>
+            <w:tcW w:type="dxa" w:w="5112"/>
+          </w:tcPr>
+          <w:p>
+            <w:r>
+              <w:t>awaiting</w:t>
+            </w:r>
+          </w:p>
+        </w:tc>
+        <w:tc>
+          <w:tcPr>
+            <w:tcW w:type="dxa" w:w="5112"/>
+          </w:tcPr>
+          <w:p>
+            <w:r>
+              <w:t>Предложен, согласия на регулярную выдачу ещё нет</w:t>
+            </w:r>
+          </w:p>
+        </w:tc>
+      </w:tr>
+      <w:tr>
+        <w:trPr>
+          <w:cantSplit/>
+        </w:trPr>
+        <w:tc>
+          <w:tcPr>
+            <w:tcW w:type="dxa" w:w="5112"/>
+          </w:tcPr>
+          <w:p>
+            <w:r>
+              <w:t>active</w:t>
+            </w:r>
+          </w:p>
+        </w:tc>
+        <w:tc>
+          <w:tcPr>
+            <w:tcW w:type="dxa" w:w="5112"/>
+          </w:tcPr>
+          <w:p>
+            <w:r>
+              <w:t>Кандидат включил выдачу</w:t>
+            </w:r>
+          </w:p>
+        </w:tc>
+      </w:tr>
+      <w:tr>
+        <w:trPr>
+          <w:cantSplit/>
+        </w:trPr>
+        <w:tc>
+          <w:tcPr>
+            <w:tcW w:type="dxa" w:w="5112"/>
+          </w:tcPr>
+          <w:p>
+            <w:r>
+              <w:t>paused</w:t>
+            </w:r>
+          </w:p>
+        </w:tc>
+        <w:tc>
+          <w:tcPr>
+            <w:tcW w:type="dxa" w:w="5112"/>
+          </w:tcPr>
+          <w:p>
+            <w:r>
+              <w:t>Кандидат приостановил либо отозвал публикацию</w:t>
+            </w:r>
+          </w:p>
+        </w:tc>
+      </w:tr>
+      <w:tr>
+        <w:trPr>
+          <w:cantSplit/>
+        </w:trPr>
+        <w:tc>
+          <w:tcPr>
+            <w:tcW w:type="dxa" w:w="5112"/>
+          </w:tcPr>
+          <w:p>
+            <w:r>
+              <w:t>closed</w:t>
+            </w:r>
+          </w:p>
+        </w:tc>
+        <w:tc>
+          <w:tcPr>
+            <w:tcW w:type="dxa" w:w="5112"/>
+          </w:tcPr>
+          <w:p>
+            <w:r>
+              <w:t>Окончательно закрыт любой стороной</w:t>
+            </w:r>
+          </w:p>
+        </w:tc>
+      </w:tr>
+    </w:tbl>
+    <w:p>
+      <w:r>
+        <w:t>При включении первое задание выдаётся сразу. Worker проверяет планы каждые 60 секунд. Следующая выдача наступает не ранее указанной даты и только после завершения предыдущего задания: ожидающий проверки ответ блокирует новую выдачу. После простоя выдаётся максимум одно задание без накопленной очереди. При возобновлении новый отсчёт начинается с текущего момента. План повторяет тот же шаблон, автоматически новые тексты не генерируются.</w:t>
+      </w:r>
+    </w:p>
+    <w:p>
+      <w:pPr>
+        <w:pStyle w:val="Heading2"/>
+      </w:pPr>
+      <w:r>
+        <w:t>Ответ, проверка и приватность</w:t>
+      </w:r>
+    </w:p>
+    <w:p>
+      <w:r>
+        <w:t>Кандидат отправляет текст до серверного срока. После отправки редактирования нет. Работодатель вручную ставит 0…100 и комментарий; повтор одинакового запроса безопасен, изменение уже сохранённой оценки отвергается. Просроченное задание не принимает ответ. Пауза/закрытие отменяет ещё не сданные задания; уже сданное можно оценить при действующем доступе. Пропуск не понижает грейд.</w:t>
+      </w:r>
+    </w:p>
+    <w:p>
+      <w:r>
+        <w:t>Вкладка и счётчик обновляются каждые 30 секунд. Кандидат видит предложения и ожидающие ответа задания, работодатель — ответы на проверку. Это уведомления в приложении; почтовая доставка не подключалась. Дата последней проверки показывается отдельно, без присвоения подтверждённого навыка или изменения формулы ранжирования. Другие компании не получают ответы и оценки.</w:t>
+      </w:r>
+    </w:p>
+    <w:p>
+      <w:r>
+        <w:t>Отзыв публикации/обработки приостанавливает планы, отменяет открытые задания и скрывает ответы от компании. Повторная публикация не возвращает прежнее право на контакты и не включает выдачу автоматически. Собственная история кандидата сохраняется. Скачанное/прочитанное ранее невозможно отозвать.</w:t>
+      </w:r>
+    </w:p>
+    <w:p>
+      <w:pPr>
+        <w:pStyle w:val="Heading2"/>
+      </w:pPr>
+      <w:r>
+        <w:t>Проверки и границы</w:t>
+      </w:r>
+    </w:p>
+    <w:p>
+      <w:r>
+        <w:t>tests/test_employer_tasks.py проверяет полный цикл, две компании/кандидатов, отзыв, неизменность грейда, конкурентные worker/отправки, сроки, идемпотентность, паузу и отсутствие пачки после простоя. tests/browser_tasks.py проходит согласие, ответ, оценку и отзыв через UI; подготовка аккаунтов/приглашения идёт через API. Мобильные ширины 360/390/768 px проверены в Chromium.</w:t>
+      </w:r>
+    </w:p>
+    <w:p>
+      <w:r>
+        <w:t>Нет автоматической оценки свободного текста, вложений, ротации шаблонов, редактирования выданного задания, пагинации большой истории и отдельной панели мониторинга worker. Ручная оценка работодателя сама по себе не является независимой сертификацией профессионального уровня.</w:t>
+      </w:r>
+    </w:p>
+    <w:p>
+      <w:pPr>
+        <w:pStyle w:val="Heading1"/>
+        <w:pageBreakBefore/>
+      </w:pPr>
+      <w:r>
+        <w:t>Протоколы независимой проверки качества</w:t>
+      </w:r>
+    </w:p>
+    <w:p>
+      <w:r>
+        <w:t>Инструменты готовы; реальные люди и независимые оценки не предоставлены. На 11 октября 2026 человеческий пилот: not_run, 0 участников. Исследовательские V4/V4-CV не включены в API; production_promotion_allowed=false. Сертификация внешним органом не проводилась. Нельзя выдавать тесты скрипта за исследование.</w:t>
+      </w:r>
+    </w:p>
+    <w:p>
+      <w:pPr>
+        <w:pStyle w:val="Heading2"/>
+      </w:pPr>
+      <w:r>
+        <w:t>Повторяемость грейдов и разделяющая сила</w:t>
+      </w:r>
+    </w:p>
+    <w:p>
+      <w:r>
+        <w:t>Подготовка форм и рубрики описана в HUMAN_PILOT.md. Новый анализ:</w:t>
+      </w:r>
+    </w:p>
+    <w:p>
+      <w:pPr>
+        <w:pStyle w:val="NoSpacing"/>
+      </w:pPr>
+      <w:r>
+        <w:rPr>
+          <w:rFonts w:ascii="DejaVu Sans Mono" w:hAnsi="DejaVu Sans Mono"/>
+          <w:sz w:val="16"/>
+        </w:rPr>
+        <w:t>PYTHONPATH=apps/api:. .venv/bin/python -m evaluation.pilot prepare --root audit/new-pilot</w:t>
+        <w:br/>
+        <w:t>PYTHONPATH=apps/api:. .venv/bin/python -m evaluation.pilot_analysis --root audit/new-pilot</w:t>
+      </w:r>
+    </w:p>
+    <w:p>
+      <w:r>
+        <w:t>prepare создаёт 12 замороженных форм A/B, отдельный закрытый ключ, participants.csv, responses.csv, expert-review.csv, sessions.csv и SHA-256. Персональные данные и ключи остаются вне GitHub. Ожидаемый исход берётся из независимого источника до теста. Если источника нет, метка остаётся пустой. Порядок A/B чередуют; между формами не раскрывают ответы. Интервал заранее фиксируют в протоколе.</w:t>
+      </w:r>
+    </w:p>
+    <w:p>
+      <w:r>
+        <w:t>sessions.csv содержит participant_id, form_id, started_at, submitted_at. Время — ISO с часовым поясом, окончание после начала; пара одного участника не пересекается. Отсутствие времени не заменяется выдуманным интервалом. Пилот проводится на слепых формах, не в демоинтерфейсе с немедленным разбором.</w:t>
+      </w:r>
+    </w:p>
+    <w:p>
+      <w:r>
+        <w:t>analysis.json добавляет согласие A/B и 95% bootstrap-интервал по участникам (2 000 повторов), корреляцию баллов, среднее абсолютное изменение, интервал повторного прохождения, corrected item–rest корреляцию по семействам внутри категории (только первая форма участника), разность сильной/слабой группы по независимым меткам и полноту экспертного ревью. Нет достаточных наблюдений или вариации — null. При одном участнике доверительный интервал не выдаётся.</w:t>
+      </w:r>
+    </w:p>
+    <w:p>
+      <w:r>
+        <w:t>Эти показатели дополняют симуляцию PR.1, а не заменяют её доказательством на людях. Малая выборка и зависимость заданий ограничивают выводы. Отрицательная разделяющая сила требует разбора задания; правка рубрики после просмотра результатов требует новой итоговой выборки. Проверка скрипта не доказывает независимость людей, указанную в строках CSV.</w:t>
+      </w:r>
+    </w:p>
+    <w:p>
+      <w:pPr>
+        <w:pStyle w:val="Heading2"/>
+      </w:pPr>
+      <w:r>
+        <w:t>Итоговая оценка ранжирования</w:t>
+      </w:r>
+    </w:p>
+    <w:p>
+      <w:r>
+        <w:t>Предпочтительная метрика — macro NDCG@10 по независимым запросам работодателей на заранее замороженных списках кандидатов. Каждую пару оценивают минимум два независимых проверяющих по 0/1/2: не подходит / частично / подходит. Недостаточно сведений — пустая метка, не отрицательная. Проверяющие получают один и тот же контекст и критерии, но не баллы/порядок моделей и не исход приглашения. Разногласия сохраняются; текущий расчёт использует среднюю оценку.</w:t>
+      </w:r>
+    </w:p>
+    <w:p>
+      <w:r>
+        <w:t>До разметки фиксируются обе модели, запросы, кандидаты и component: связанная группа запросов/объектов, пересекающаяся по кандидату, вакансии, организации либо дубликатам. Одна группа не должна попадать в обучение и итоговую оценку. Группировку готовит исследователь: скрипт не обнаруживает утечку по текстам. Test нельзя использовать для выбора признаков, порога или гиперпараметров.</w:t>
+      </w:r>
+    </w:p>
+    <w:p>
+      <w:r>
+        <w:t>Вход JSON приватный, псевдонимизированный, с проверенными правами на тексты:</w:t>
+      </w:r>
+    </w:p>
+    <w:p>
+      <w:pPr>
+        <w:pStyle w:val="NoSpacing"/>
+      </w:pPr>
+      <w:r>
+        <w:rPr>
+          <w:rFonts w:ascii="DejaVu Sans Mono" w:hAnsi="DejaVu Sans Mono"/>
+          <w:sz w:val="16"/>
+        </w:rPr>
+        <w:t>{"queries":[{"id":"q1","component":"component1","text":"Потребность",</w:t>
+        <w:br/>
+        <w:t xml:space="preserve"> "candidates":[{"id":"c1","text":"Обезличенные доказательства",</w:t>
+        <w:br/>
+        <w:t xml:space="preserve"> "scores":{"baseline":0.3,"challenger":0.4}}]}]}</w:t>
+      </w:r>
+    </w:p>
+    <w:p>
+      <w:pPr>
+        <w:pStyle w:val="NoSpacing"/>
+      </w:pPr>
+      <w:r>
+        <w:rPr>
+          <w:rFonts w:ascii="DejaVu Sans Mono" w:hAnsi="DejaVu Sans Mono"/>
+          <w:sz w:val="16"/>
+        </w:rPr>
+        <w:t>PYTHONPATH=apps/api:. .venv/bin/python -m evaluation.relevance_benchmark prepare --source audit/input.json --root audit/new-study</w:t>
+        <w:br/>
+        <w:t>PYTHONPATH=apps/api:. .venv/bin/python -m evaluation.relevance_benchmark evaluate --root audit/new-study</w:t>
+      </w:r>
+    </w:p>
+    <w:p>
+      <w:r>
+        <w:t>prepare разрешён в пустом каталоге. Он сохраняет закрытые баллы, перемешанный blind-review.json без баллов, пустой judgments.csv и замороженный протокол. Столбцы разметки: query_id,candidate_id,reviewer_id,relevance,source. Поле source объясняет независимое основание. Хеши препятствуют незаметной правке в обычном процессе, но не удостоверяют время и внешнюю независимость.</w:t>
+      </w:r>
+    </w:p>
+    <w:p>
+      <w:r>
+        <w:t>В расчёт входят полностью размеченные запросы с минимум 10 кандидатами и ненулевым идеальным DCG. Остальные перечислены в excluded_queries. Отдельно выводятся покрытие, согласие проверяющих, baseline/challenger, парная разность и 95% bootstrap-интервал по связанным компонентам (2 000 повторов). Повторение одной пары не увеличивает число независимых компонент.</w:t>
+      </w:r>
+    </w:p>
+    <w:p>
+      <w:r>
+        <w:t>Статистический барьер: полное покрытие замороженных запросов, минимум 20 компонент и нижняя граница интервала прироста выше нуля. Число 20 — заранее выбранный консервативный инженерный минимум, не расчёт мощности и не гарантия репрезентативности. Даже statistical_gate_passed=true не разрешает внедрение: production_promotion_allowed остаётся false до отдельной проверки происхождения, независимости, приватности и продуктового сценария. Скрипт не меняет API.</w:t>
+      </w:r>
+    </w:p>
+    <w:p>
+      <w:pPr>
+        <w:pStyle w:val="Heading2"/>
+      </w:pPr>
+      <w:r>
+        <w:t>Упаковка результата</w:t>
+      </w:r>
+    </w:p>
+    <w:p>
+      <w:r>
+        <w:t>Публичный пакет: паспорт версии, ссылки на первоисточники и условия использования, схемы, протокол до эксперимента, алгоритм разделения, агрегированные метрики, покрытие/исключения, команды и SHA-256. Отдельно обозначаются синтетический eval, реальные поведенческие метки trudvsem и будущие независимые экспертные оценки. Не публиковать исходные CV, почту, телефоны, ключи к тестам и закрытые баллы слепого исследования. Исходные корпуса этой модернизацией не менялись.</w:t>
+      </w:r>
+    </w:p>
+    <w:p>
+      <w:r>
+        <w:t>Без разметчиков возможно продолжать обучение на исторических взаимодействиях и сравнение по времени/компонентам, но нельзя переименовать отклик в доказанную релевантность или выдать такой набор за сертифицированный. Новые данные и DeepSeek в этой работе не использовались.</w:t>
       </w:r>
     </w:p>
     <w:sectPr>

</xml_diff>

<commit_message>
Verify Gmail delivery end to end, secure SMTP TLS, and publish updated service documentation
</commit_message>
<xml_diff>
--- a/docs/delivery/FSP_MVP.docx
+++ b/docs/delivery/FSP_MVP.docx
@@ -19,7 +19,7 @@
       <w:r>
         <w:t>Обратный найм по подтверждённым навыкам</w:t>
         <w:br/>
-        <w:t>Редакция 11 октября 2026 · релиз 2026-10-11-modernization</w:t>
+        <w:t>Редакция 11 октября 2026 · релиз 2026-10-11-mail-verification</w:t>
       </w:r>
     </w:p>
     <w:p>
@@ -104,6 +104,11 @@
     </w:p>
     <w:p>
       <w:r>
+        <w:t>12. Почтовая интеграция и проверка доставки</w:t>
+      </w:r>
+    </w:p>
+    <w:p>
+      <w:r>
         <w:t>Версии: API 1.0.0 · банк 2.0.0 · подбор matching-1.1.0. Источники разделов и ссылки: docs/delivery/README.md в репозитории.</w:t>
       </w:r>
     </w:p>
@@ -118,7 +123,7 @@
     </w:p>
     <w:p>
       <w:r>
-        <w:t>Редакция 11 октября 2026. Стенд: https://85-137-26-131.sslip.io/. Работает демонстрационный режим: подтверждение почты имитируется, достижения ФСП выдаёт явно обозначенный демопровайдер. Для независимой проверки сценария создавайте собственные вымышленные аккаунты: у общих демоаккаунтов сохраняются предыдущие попытки и ограничения. Пароли участников команды в руководстве не публикуются.</w:t>
+        <w:t>Редакция 11 октября 2026. Стенд: https://85-137-26-131.sslip.io/. На публичном стенде письмо подтверждения приходит на указанный адрес. Откройте ссылку в течение часа, затем перейдите на вкладку «Вход». Проверьте также папку «Спам». Без SMTP на отдельном локальном стенде доступна демоссылка. Достижения ФСП выдаёт демопровайдер. Для проверки используйте контролируемый ящик и вымышленный профиль: у общих демоаккаунтов сохраняются предыдущие попытки и ограничения. Пароли участников команды в руководстве не публикуются.</w:t>
       </w:r>
     </w:p>
     <w:p>
@@ -131,7 +136,7 @@
     </w:p>
     <w:p>
       <w:r>
-        <w:t>1. Зарегистрируйтесь с ролью кандидата и подтвердите почту доступным в демо способом.</w:t>
+        <w:t>1. Зарегистрируйтесь с ролью кандидата и откройте ссылку из полученного письма и войдите в кабинет.</w:t>
       </w:r>
     </w:p>
     <w:p>
@@ -469,7 +474,7 @@
     </w:p>
     <w:p>
       <w:r>
-        <w:t>Состояние приложения: 2026-10-11-modernization, банк 2.0.0, подбор matching-1.1.0.</w:t>
+        <w:t>Состояние приложения: 2026-10-11-mail-verification, банк 2.0.0, подбор matching-1.1.0.</w:t>
       </w:r>
     </w:p>
     <w:p>
@@ -1180,7 +1185,7 @@
     </w:p>
     <w:p>
       <w:r>
-        <w:t>Текущий релиз — 2026-10-11-modernization, банк 2.0.0, matching-1.1.0. Документ объединяет результаты разных дат с указанием границ. Обновление документации не означает повторного запуска всех перечисленных экспериментов. Первоначальный отчёт сохранён в VALIDATION_2026-10-07.md; его показатели относятся к старым версиям и не являются текущими метриками.</w:t>
+        <w:t>Текущий релиз — 2026-10-11-mail-verification, банк 2.0.0, matching-1.1.0. Документ объединяет результаты разных дат с указанием границ. Обновление документации не означает повторного запуска всех перечисленных экспериментов. Первоначальный отчёт сохранён в VALIDATION_2026-10-07.md; его показатели относятся к старым версиям и не являются текущими метриками.</w:t>
       </w:r>
     </w:p>
     <w:p>
@@ -1268,7 +1273,7 @@
           </w:tcPr>
           <w:p>
             <w:r>
-              <w:t>84 passed, 29,06 с, 2 предупреждения устаревших зависимостей</w:t>
+              <w:t>92 passed, 30,78 с, 2 предупреждения устаревших зависимостей</w:t>
             </w:r>
           </w:p>
         </w:tc>
@@ -1520,7 +1525,7 @@
     </w:p>
     <w:p>
       <w:r>
-        <w:t>Реальный SMTP, ФСП/Keycloak, человеческий пилот, экспертная разметка, прокторинг, производственная аттестация и полное чтение стороннего архива не подтверждены. Публичный HTTPS работает и проверен; прежняя фраза об отсутствии домена более не актуальна. E09 реализован в адресном варианте: TASKS.md. Новый результат приёмки и чистого восстановления приведён ниже.</w:t>
+        <w:t>ФСП/Keycloak, человеческий пилот, экспертная разметка, прокторинг, производственная аттестация и полное чтение стороннего архива не подтверждены. Публичный HTTPS работает и проверен; прежняя фраза об отсутствии домена более не актуальна. E09 реализован в адресном варианте: TASKS.md. Новый результат приёмки и чистого восстановления приведён ниже.</w:t>
       </w:r>
     </w:p>
     <w:p>
@@ -1553,6 +1558,39 @@
     </w:p>
     <w:p>
       <w:pPr>
+        <w:pStyle w:val="Heading2"/>
+      </w:pPr>
+      <w:r>
+        <w:t>Повторная проверка сервиса и настоящей почты</w:t>
+      </w:r>
+    </w:p>
+    <w:p>
+      <w:r>
+        <w:t>11 октября 2026 (вечер, МСК): 92 backend-теста, 55 склонений, 18 браузерных сценариев требований, 11 проверок адресных заданий — pass. Дополнительно проверена ссылка подтверждения при смене hash без перезагрузки: pass, токен удаляется из адресной строки, повтор отклоняется. Сборки TypeScript/Vite и Docker API/web прошли; публичный HTTPS и OpenAPI совпадают с документацией.</w:t>
+      </w:r>
+    </w:p>
+    <w:p>
+      <w:r>
+        <w:t>Реальная почта: SMTP STARTTLS с проверкой сертификата, IMAP SSL и два письма регистрации (кандидат/работодатель) в контролируемый Gmail-ящик. Оба письма получены, ссылки открыты через UI, вход до подтверждения запрещён, повтор ссылки отклонён, вход после подтверждения успешен. В API нет токена и демоссылки при настоящем SMTP. Это не проверка доставки всем провайдерам. Первый промежуточный прогон получил письмо и подтвердил адрес, но закончился AssertionError на составном шаге verify; оснастка уточнена, переключение на вкладку входа сделано явным, финальный прогон обеих ролей прошёл. Всего отправлено три контрольных письма, из них два в успешном итоговом прогоне.</w:t>
+      </w:r>
+    </w:p>
+    <w:p>
+      <w:r>
+        <w:t>Исправлено: SMTP STARTTLS больше не использует контекст CERT_NONE; включены проверка цепочки сертификатов и имени сервера. Добавлены Date/Message-ID и понятное уведомление о письме. Ошибки настроек, авторизации, TLS, таймаута и отказ адресата возвращают 503 с откатом регистрации; секреты не раскрываются. Автотесты изолированы от SMTP окружения, чтобы случайно не отправить письма.</w:t>
+      </w:r>
+    </w:p>
+    <w:p>
+      <w:r>
+        <w:t>Повтор нагрузки: 30 вымышленных сессий, 270 чтений, 12 опубликованных демопрофилей; 0 ошибок, общий p95 3,38 с, 12,87 с на прогон. Это ограниченный замер на отдельном стенде, не нагрузка записи/почты и не долговременный soak. Аудит закреплённых runtime-зависимостей pip и npm: известных уязвимостей 0; это проверка баз предупреждений на дату запуска, не полный аудит безопасности.</w:t>
+      </w:r>
+    </w:p>
+    <w:p>
+      <w:r>
+        <w:t>Артефакты: docs/review/mail-verification-2026-10-11/. Подробности доставки, команды и ограничения — MAIL.md. Данные ящика, пароль, письма и токены в публичный комплект не включены. Неизменённые исследования V4/пилот на людях не пересчитывались; их ограничения сохраняются.</w:t>
+      </w:r>
+    </w:p>
+    <w:p>
+      <w:pPr>
         <w:pStyle w:val="Heading1"/>
         <w:pageBreakBefore/>
       </w:pPr>
@@ -1562,12 +1600,12 @@
     </w:p>
     <w:p>
       <w:r>
-        <w:t>Релиз 2026-10-11-modernization; банк 2.0.0; подбор matching-1.1.0.</w:t>
+        <w:t>Релиз 2026-10-11-mail-verification; банк 2.0.0; подбор matching-1.1.0.</w:t>
       </w:r>
     </w:p>
     <w:p>
       <w:r>
-        <w:t>Исходные формулировки и источники сохранены в docs/REQUIREMENTS_MATRIX.md. pass означает исполненный сценарий в указанной границе MVP, не отсутствие любых ошибок. Ограничения не скрыты в этом статусе. Общие результаты и команды — VALIDATION.md; внешний SMTP/ФСП и человеческий пилот — not_run.</w:t>
+        <w:t>Исходные формулировки и источники сохранены в docs/REQUIREMENTS_MATRIX.md. pass означает исполненный сценарий в указанной границе MVP, не отсутствие любых ошибок. Ограничения не скрыты в этом статусе. Общие результаты и команды — VALIDATION.md; SMTP проверен в Gmail; внешний ФСП и человеческий пилот — not_run.</w:t>
       </w:r>
     </w:p>
     <w:tbl>
@@ -1668,7 +1706,7 @@
           </w:tcPr>
           <w:p>
             <w:r>
-              <w:t>pass в демо; реальная SMTP-доставка not_run</w:t>
+              <w:t>pass: SMTP → получение IMAP → ссылка → вход обеих ролей; один контролируемый Gmail-ящик</w:t>
             </w:r>
           </w:p>
         </w:tc>
@@ -2918,7 +2956,7 @@
           </w:tcPr>
           <w:p>
             <w:r>
-              <w:t>30 пользователей, 270 чтений, p95 3,04 с, 0 ошибок</w:t>
+              <w:t>30 пользователей, 270 чтений, p95 3,38 с, 0 ошибок (повторный замер 11 октября)</w:t>
             </w:r>
           </w:p>
         </w:tc>
@@ -3269,7 +3307,7 @@
     </w:p>
     <w:p>
       <w:r>
-        <w:t>Последние регрессии: 84 серверных теста, 55 проверок склонений и 18 браузерных проверок требований. Состав попытки, история, 24/90 дней и закрытые/открытые PDF проверены отдельно; подробности и границы — VALIDATION.md.</w:t>
+        <w:t>Последние регрессии: 92 серверных теста, 55 проверок склонений и 18 браузерных проверок требований. Состав попытки, история, 24/90 дней и закрытые/открытые PDF проверены отдельно; подробности и границы — VALIDATION.md.</w:t>
       </w:r>
     </w:p>
     <w:p>
@@ -4294,7 +4332,7 @@
     </w:p>
     <w:p>
       <w:r>
-        <w:t>Для реальной доставки нужны SMTP_HOST/PORT/FROM, при необходимости USER/PASSWORD, SMTP_TLS=true и DEMO_MODE=false. При отсутствии доставки регистрация откатывается и возвращает 503, токен не показывается. При рабочем SMTP в ответе нет демонстрационной ссылки. Реальная отправка в этой сдаче не запускалась.</w:t>
+        <w:t>Для реальной доставки нужны SMTP_HOST/PORT/FROM, при необходимости USER/PASSWORD, SMTP_TLS=true. При заданном SMTP_HOST доставка реальная даже в DEMO_MODE=true. При отсутствии SMTP вне деморежима регистрация откатывается и возвращает 503, токен не показывается. При рабочем SMTP в ответе нет демонстрационной ссылки. Gmail SMTP проверен реальной отправкой, получением и входом обеих ролей; MAIL.md.</w:t>
       </w:r>
     </w:p>
     <w:p>
@@ -4479,7 +4517,7 @@
     </w:p>
     <w:p>
       <w:r>
-        <w:t>Коллеги независимо подключили SMTP во время модернизации. Сохранено правило: если SMTP_HOST задан, регистрация использует настоящую доставку даже при DEMO_MODE=true; демоссылка в этом случае не возвращается. Без SMTP_HOST демоссылка доступна только в деморежиме, иначе 503. Модернизация не проверяла внешнюю доставку и не меняла почтовые секреты. Поэтому acceptance запускать на отдельном демостенде с пустым SMTP_HOST, а не на публичном сайте с почтой.</w:t>
+        <w:t>Коллеги независимо подключили SMTP во время модернизации. Сохранено правило: если SMTP_HOST задан, регистрация использует настоящую доставку даже при DEMO_MODE=true; демоссылка в этом случае не возвращается. Без SMTP_HOST демоссылка доступна только в деморежиме, иначе 503. Первоначальная модернизация не проверяла доставку; последующая проверка 11 октября подтвердила её (MAIL.md). Поэтому полный acceptance запускать на отдельном демостенде с пустым SMTP_HOST, а не на публичном сайте с почтой.</w:t>
       </w:r>
     </w:p>
     <w:p>
@@ -4866,6 +4904,179 @@
         <w:t>Без разметчиков возможно продолжать обучение на исторических взаимодействиях и сравнение по времени/компонентам, но нельзя переименовать отклик в доказанную релевантность или выдать такой набор за сертифицированный. Новые данные и DeepSeek в этой работе не использовались.</w:t>
       </w:r>
     </w:p>
+    <w:p>
+      <w:pPr>
+        <w:pStyle w:val="Heading1"/>
+        <w:pageBreakBefore/>
+      </w:pPr>
+      <w:r>
+        <w:t>Почтовая интеграция и проверка доставки</w:t>
+      </w:r>
+    </w:p>
+    <w:p>
+      <w:r>
+        <w:t>Редакция 11 октября 2026. На публичном HTTPS-стенде настроен Gmail SMTP. Реальная регистрация проверена для кандидата и работодателя: письмо отправлено, получено в контролируемом ящике через IMAP, ссылка открыта в браузере, адрес подтверждён, вход успешен. Неподтверждённый адрес не допускается к входу; повторное использование ссылки отклоняется. Пароль и адрес оператора не публикуются.</w:t>
+      </w:r>
+    </w:p>
+    <w:p>
+      <w:pPr>
+        <w:pStyle w:val="Heading2"/>
+      </w:pPr>
+      <w:r>
+        <w:t>Настройка</w:t>
+      </w:r>
+    </w:p>
+    <w:p>
+      <w:r>
+        <w:t>Конфигурация находится только в закрытом .env, права 0600:</w:t>
+      </w:r>
+    </w:p>
+    <w:p>
+      <w:pPr>
+        <w:pStyle w:val="NoSpacing"/>
+      </w:pPr>
+      <w:r>
+        <w:rPr>
+          <w:rFonts w:ascii="DejaVu Sans Mono" w:hAnsi="DejaVu Sans Mono"/>
+          <w:sz w:val="16"/>
+        </w:rPr>
+        <w:t>SMTP_HOST=smtp.gmail.com</w:t>
+        <w:br/>
+        <w:t>SMTP_PORT=587</w:t>
+        <w:br/>
+        <w:t>SMTP_TLS=true</w:t>
+        <w:br/>
+        <w:t>SMTP_USER=YOUR_CONTROLLED_ADDRESS@gmail.com</w:t>
+        <w:br/>
+        <w:t>SMTP_FROM=YOUR_CONTROLLED_ADDRESS@gmail.com</w:t>
+        <w:br/>
+        <w:t>SMTP_PASSWORD=APP_PASSWORD_WITHOUT_SPACES</w:t>
+        <w:br/>
+        <w:t>PUBLIC_URL=https://YOUR_PUBLIC_HOST</w:t>
+        <w:br/>
+        <w:t>COOKIE_SECURE=true</w:t>
+      </w:r>
+    </w:p>
+    <w:p>
+      <w:r>
+        <w:t>Нужен пароль приложения Google, не пароль входа в аккаунт. Настройки Gmail сверены с официальной справкой (https://support.google.com/mail/answer/7104828?hl=en). STARTTLS использует ssl.create_default_context: проверяется доверенная цепочка и имя сервера. При невозможности TLS отправка прекращается; автоматического перехода на незашифрованную аутентификацию нет при SMTP_TLS=true.</w:t>
+      </w:r>
+    </w:p>
+    <w:p>
+      <w:r>
+        <w:t>Если SMTP_HOST задан, настоящая доставка работает даже при DEMO_MODE=true, когда демонстрационные профили/ФСП остаются доступны. Ответ регистрации содержит delivery=smtp, demo_verification_url=null; verification-токен не возвращается. Без SMTP_HOST демонстрация выдаёт ссылку локально; вне деморежима отсутствие почты возвращает 503. После изменения .env необходимо пересоздать API:</w:t>
+      </w:r>
+    </w:p>
+    <w:p>
+      <w:pPr>
+        <w:pStyle w:val="NoSpacing"/>
+      </w:pPr>
+      <w:r>
+        <w:rPr>
+          <w:rFonts w:ascii="DejaVu Sans Mono" w:hAnsi="DejaVu Sans Mono"/>
+          <w:sz w:val="16"/>
+        </w:rPr>
+        <w:t>docker compose up -d --no-deps --wait api</w:t>
+      </w:r>
+    </w:p>
+    <w:p>
+      <w:r>
+        <w:t>Не печатайте resolved Compose config, .env или SMTP debug-трассу в общий лог. Не отправляйте тестовые письма случайным адресатам.</w:t>
+      </w:r>
+    </w:p>
+    <w:p>
+      <w:pPr>
+        <w:pStyle w:val="Heading2"/>
+      </w:pPr>
+      <w:r>
+        <w:t>Как проверялось</w:t>
+      </w:r>
+    </w:p>
+    <w:p>
+      <w:r>
+        <w:t>Скрипт scripts/check_mail_delivery.py запускается только по разрешению владельца контролируемого Gmail-ящика. Он создаёт два уникальных plus-адреса этого же ящика и две регистрации с вымышленными неопубликованными профилями. IMAP ищет только эти сообщения и читает BODY.PEEK, не удаляя письма и не помечая их прочитанными.</w:t>
+      </w:r>
+    </w:p>
+    <w:p>
+      <w:pPr>
+        <w:pStyle w:val="NoSpacing"/>
+      </w:pPr>
+      <w:r>
+        <w:rPr>
+          <w:rFonts w:ascii="DejaVu Sans Mono" w:hAnsi="DejaVu Sans Mono"/>
+          <w:sz w:val="16"/>
+        </w:rPr>
+        <w:t>.venv/bin/python scripts/run_local.py .venv/bin/python scripts/check_mail_delivery.py --base-url https://YOUR_PUBLIC_HOST --recipient YOUR_CONTROLLED_ADDRESS@gmail.com --out audit/mail-check</w:t>
+      </w:r>
+    </w:p>
+    <w:p>
+      <w:r>
+        <w:t>Проверяется UI-регистрация, отсутствие демонстрационной ссылки, запрет входа до подтверждения, получение письма, открытие ссылки, удаление токена из URL, одноразовость, вход и роль. Каждый запуск действительно отправляет до двух писем и создаёт аккаунты; это не обычный unit-тест. Ошибка фиксируется как этап и тип исключения без тела письма, адреса, токена и пароля.</w:t>
+      </w:r>
+    </w:p>
+    <w:p>
+      <w:r>
+        <w:t>Финальный реальный прогон: 2 отправленных / 2 полученных письма, обе роли pass. Время от начала ожидания письма до завершения проверки входа: около 4,4 и 4,2 секунды; это не чистая задержка SMTP. Первый промежуточный прогон отправил ещё одно письмо и подтвердил адрес, но остановился на UI-проверке. Его нельзя выдавать за полностью успешный прогон. Сырые письма не публикуются.</w:t>
+      </w:r>
+    </w:p>
+    <w:p>
+      <w:r>
+        <w:t>Отдельно tests/test_mail.py проверяет обе конфигурации demo/non-demo и отказы сертификата, авторизации, адресата, таймаут, неверный порт, отсутствующий пароль. При сбое нет частично созданного аккаунта/токена/согласия: транзакция откатывается, API возвращает 503 без технических секретов. Эти проверки используют заглушки SMTP и не являются доказательством настоящей доставки. Autouse-фикстура удаляет SMTP-настройки из окружения обычного pytest, предотвращая случайную отправку.</w:t>
+      </w:r>
+    </w:p>
+    <w:p>
+      <w:r>
+        <w:t>Браузерная регрессия browser_mail_navigation.py проверяет смену #verify после загрузки приложения без полной перезагрузки и отказ повторного подтверждения. Она запускается только на loopback-демостенде с имитацией почты.</w:t>
+      </w:r>
+    </w:p>
+    <w:p>
+      <w:pPr>
+        <w:pStyle w:val="Heading2"/>
+      </w:pPr>
+      <w:r>
+        <w:t>Границы и эксплуатация</w:t>
+      </w:r>
+    </w:p>
+    <w:p>
+      <w:r>
+        <w:t>- Проверен один Gmail-ящик с двумя адресами-алиасами, не два независимых провайдера.</w:t>
+      </w:r>
+    </w:p>
+    <w:p>
+      <w:r>
+        <w:t>- SPF/DKIM/DMARC pass не обнаружены в прочитанных Authentication-Results; их   независимая проверка и настройка своего домена не заявляются выполненными.</w:t>
+      </w:r>
+    </w:p>
+    <w:p>
+      <w:r>
+        <w:t>- Получение в Gmail не гарантирует доставку другим провайдерам, отсутствие спама,   отсутствие квот и бесперебойность Gmail.</w:t>
+      </w:r>
+    </w:p>
+    <w:p>
+      <w:r>
+        <w:t>- Ссылка действует час. Повторная отправка письма и восстановление пароля пока   отсутствуют; не путать это с уже работающей регистрацией и входом.</w:t>
+      </w:r>
+    </w:p>
+    <w:p>
+      <w:r>
+        <w:t>- Отправка синхронная, таймаут 10 секунд. Нет очереди/outbox, автоматических   повторов и панели доставки. Если сервер принял письмо, а ответ SMTP потерян,   возможен откат регистрации при фактически доставленном письме. Это известная   граница; надёжная очередь и согласованный outbox — отдельная доработка.</w:t>
+      </w:r>
+    </w:p>
+    <w:p>
+      <w:r>
+        <w:t>- Ограничитель регистрации локален процессу и не заменяет полноценную защиту   почтового сервиса от злоупотреблений. Массовая почтовая нагрузка не проверялась.</w:t>
+      </w:r>
+    </w:p>
+    <w:p>
+      <w:r>
+        <w:t>- Подтверждение адреса не удостоверяет личность и не сертифицирует навыки.</w:t>
+      </w:r>
+    </w:p>
+    <w:p>
+      <w:r>
+        <w:t>Артефакты без секретов: docs/review/mail-verification-2026-10-11/real-delivery.json, backend.txt, navigation.json; общая проверка — VALIDATION.md.</w:t>
+      </w:r>
+    </w:p>
     <w:sectPr>
       <w:pgSz w:w="12240" w:h="15840"/>
       <w:pgMar w:top="1080" w:right="1008" w:bottom="1080" w:left="1008" w:header="720" w:footer="720" w:gutter="0"/>

</xml_diff>